<commit_message>
added some comments in the must haves document
</commit_message>
<xml_diff>
--- a/CodeLit - must Haves.docx
+++ b/CodeLit - must Haves.docx
@@ -1,156 +1,124 @@
 
 <file path=word/document.xml><?xml version="1.0" encoding="utf-8"?>
-<w:document xmlns:mc="http://schemas.openxmlformats.org/markup-compatibility/2006" xmlns:o="urn:schemas-microsoft-com:office:office" xmlns:r="http://schemas.openxmlformats.org/officeDocument/2006/relationships" xmlns:m="http://schemas.openxmlformats.org/officeDocument/2006/math" xmlns:v="urn:schemas-microsoft-com:vml" xmlns:wp="http://schemas.openxmlformats.org/drawingml/2006/wordprocessingDrawing" xmlns:w10="urn:schemas-microsoft-com:office:word" xmlns:w="http://schemas.openxmlformats.org/wordprocessingml/2006/main" xmlns:wne="http://schemas.microsoft.com/office/word/2006/wordml" xmlns:sl="http://schemas.openxmlformats.org/schemaLibrary/2006/main" xmlns:a="http://schemas.openxmlformats.org/drawingml/2006/main" xmlns:pic="http://schemas.openxmlformats.org/drawingml/2006/picture" xmlns:c="http://schemas.openxmlformats.org/drawingml/2006/chart" xmlns:lc="http://schemas.openxmlformats.org/drawingml/2006/lockedCanvas" xmlns:dgm="http://schemas.openxmlformats.org/drawingml/2006/diagram" xmlns:wps="http://schemas.microsoft.com/office/word/2010/wordprocessingShape" xmlns:wpg="http://schemas.microsoft.com/office/word/2010/wordprocessingGroup" xmlns:w14="http://schemas.microsoft.com/office/word/2010/wordml" xmlns:w15="http://schemas.microsoft.com/office/word/2012/wordml" xmlns:w16="http://schemas.microsoft.com/office/word/2018/wordml" xmlns:w16cex="http://schemas.microsoft.com/office/word/2018/wordml/cex" xmlns:w16cid="http://schemas.microsoft.com/office/word/2016/wordml/cid" xmlns="http://schemas.microsoft.com/office/tasks/2019/documenttasks" xmlns:cr="http://schemas.microsoft.com/office/comments/2020/reactions">
+<w:document xmlns:wpc="http://schemas.microsoft.com/office/word/2010/wordprocessingCanvas" xmlns:cx="http://schemas.microsoft.com/office/drawing/2014/chartex" xmlns:cx1="http://schemas.microsoft.com/office/drawing/2015/9/8/chartex" xmlns:cx2="http://schemas.microsoft.com/office/drawing/2015/10/21/chartex" xmlns:cx3="http://schemas.microsoft.com/office/drawing/2016/5/9/chartex" xmlns:cx4="http://schemas.microsoft.com/office/drawing/2016/5/10/chartex" xmlns:cx5="http://schemas.microsoft.com/office/drawing/2016/5/11/chartex" xmlns:cx6="http://schemas.microsoft.com/office/drawing/2016/5/12/chartex" xmlns:cx7="http://schemas.microsoft.com/office/drawing/2016/5/13/chartex" xmlns:cx8="http://schemas.microsoft.com/office/drawing/2016/5/14/chartex" xmlns:mc="http://schemas.openxmlformats.org/markup-compatibility/2006" xmlns:aink="http://schemas.microsoft.com/office/drawing/2016/ink" xmlns:am3d="http://schemas.microsoft.com/office/drawing/2017/model3d" xmlns:o="urn:schemas-microsoft-com:office:office" xmlns:r="http://schemas.openxmlformats.org/officeDocument/2006/relationships" xmlns:m="http://schemas.openxmlformats.org/officeDocument/2006/math" xmlns:v="urn:schemas-microsoft-com:vml" xmlns:wp14="http://schemas.microsoft.com/office/word/2010/wordprocessingDrawing" xmlns:wp="http://schemas.openxmlformats.org/drawingml/2006/wordprocessingDrawing" xmlns:w10="urn:schemas-microsoft-com:office:word" xmlns:w="http://schemas.openxmlformats.org/wordprocessingml/2006/main" xmlns:w14="http://schemas.microsoft.com/office/word/2010/wordml" xmlns:w15="http://schemas.microsoft.com/office/word/2012/wordml" xmlns:w16cid="http://schemas.microsoft.com/office/word/2016/wordml/cid" xmlns:w16se="http://schemas.microsoft.com/office/word/2015/wordml/symex" xmlns:wpg="http://schemas.microsoft.com/office/word/2010/wordprocessingGroup" xmlns:wpi="http://schemas.microsoft.com/office/word/2010/wordprocessingInk" xmlns:wne="http://schemas.microsoft.com/office/word/2006/wordml" xmlns:wps="http://schemas.microsoft.com/office/word/2010/wordprocessingShape" mc:Ignorable="w14 w15 w16se w16cid wp14">
   <w:body>
     <w:p>
       <w:pPr>
         <w:pStyle w:val="Heading1"/>
         <w:keepNext w:val="0"/>
         <w:keepLines w:val="0"/>
-        <w:spacing w:after="240" w:before="240" w:lineRule="auto"/>
-        <w:rPr>
-          <w:b w:val="1"/>
-          <w:bCs w:val="1"/>
+        <w:spacing w:before="240" w:after="240"/>
+        <w:rPr>
+          <w:b/>
+          <w:bCs/>
           <w:sz w:val="50"/>
           <w:szCs w:val="50"/>
         </w:rPr>
       </w:pPr>
-      <w:bookmarkStart w:colFirst="0" w:colLast="0" w:name="_bxp7dc5q8rz9" w:id="0"/>
+      <w:bookmarkStart w:id="0" w:name="_bxp7dc5q8rz9" w:colFirst="0" w:colLast="0"/>
       <w:bookmarkEnd w:id="0"/>
-      <w:r>
-        <w:rPr>
-          <w:b w:val="1"/>
-          <w:bCs w:val="1"/>
+      <w:proofErr w:type="spellStart"/>
+      <w:r>
+        <w:rPr>
+          <w:b/>
+          <w:bCs/>
           <w:sz w:val="50"/>
           <w:szCs w:val="50"/>
-          <w:rtl w:val="0"/>
-        </w:rPr>
-        <w:t xml:space="preserve">CodeLit</w:t>
-      </w:r>
-    </w:p>
-    <w:p>
-      <w:pPr>
-        <w:spacing w:after="240" w:before="240" w:lineRule="auto"/>
-        <w:jc w:val="both"/>
-        <w:rPr/>
-      </w:pPr>
-      <w:r>
-        <w:rPr>
-          <w:rtl w:val="0"/>
-        </w:rPr>
-        <w:t xml:space="preserve">A Windows Desktop Application for Secure Exam Lockdown and Automated Programming Assessment in Philippine Computing Education </w:t>
-      </w:r>
-    </w:p>
-    <w:p>
-      <w:pPr>
-        <w:spacing w:after="240" w:before="240" w:lineRule="auto"/>
-        <w:rPr>
-          <w:b w:val="1"/>
-          <w:bCs w:val="1"/>
-        </w:rPr>
-      </w:pPr>
-      <w:r>
-        <w:rPr>
-          <w:b w:val="1"/>
-          <w:bCs w:val="1"/>
-          <w:rtl w:val="0"/>
-        </w:rPr>
-        <w:t xml:space="preserve">Proponents:</w:t>
-      </w:r>
-    </w:p>
-    <w:p>
-      <w:pPr>
-        <w:spacing w:before="240" w:lineRule="auto"/>
+        </w:rPr>
+        <w:t>CodeLit</w:t>
+      </w:r>
+      <w:proofErr w:type="spellEnd"/>
+    </w:p>
+    <w:p>
+      <w:pPr>
+        <w:spacing w:before="240" w:after="240"/>
+        <w:jc w:val="both"/>
+      </w:pPr>
+      <w:r>
+        <w:t xml:space="preserve">A Windows Desktop </w:t>
+      </w:r>
+      <w:r>
+        <w:t xml:space="preserve">and Web </w:t>
+      </w:r>
+      <w:r>
+        <w:t xml:space="preserve">Application for Secure Exam Lockdown and Automated Programming Assessment in Philippine Computing Education </w:t>
+      </w:r>
+    </w:p>
+    <w:p>
+      <w:pPr>
+        <w:spacing w:before="240" w:after="240"/>
+        <w:rPr>
+          <w:b/>
+          <w:bCs/>
+        </w:rPr>
+      </w:pPr>
+      <w:r>
+        <w:rPr>
+          <w:b/>
+          <w:bCs/>
+        </w:rPr>
+        <w:t>Proponents:</w:t>
+      </w:r>
+    </w:p>
+    <w:p>
+      <w:pPr>
+        <w:spacing w:before="240"/>
         <w:ind w:left="1080" w:hanging="360"/>
-        <w:rPr/>
-      </w:pPr>
-      <w:r>
-        <w:rPr>
-          <w:rtl w:val="0"/>
-        </w:rPr>
-        <w:t xml:space="preserve">●</w:t>
+      </w:pPr>
+      <w:r>
+        <w:t>●</w:t>
       </w:r>
       <w:r>
         <w:rPr>
           <w:sz w:val="14"/>
           <w:szCs w:val="14"/>
-          <w:rtl w:val="0"/>
         </w:rPr>
         <w:t xml:space="preserve">        </w:t>
       </w:r>
-      <w:r>
-        <w:rPr>
-          <w:rtl w:val="0"/>
-        </w:rPr>
-        <w:t xml:space="preserve">Aratia, Brian Joseph B.</w:t>
-      </w:r>
-      <w:r>
-        <w:rPr>
-          <w:rtl w:val="0"/>
-        </w:rPr>
+      <w:proofErr w:type="spellStart"/>
+      <w:r>
+        <w:t>Aratia</w:t>
+      </w:r>
+      <w:proofErr w:type="spellEnd"/>
+      <w:r>
+        <w:t>, Brian Joseph B.</w:t>
       </w:r>
     </w:p>
     <w:p>
       <w:pPr>
         <w:ind w:left="1080" w:hanging="360"/>
-        <w:rPr/>
-      </w:pPr>
-      <w:r>
-        <w:rPr>
-          <w:rtl w:val="0"/>
-        </w:rPr>
-        <w:t xml:space="preserve">●</w:t>
+      </w:pPr>
+      <w:r>
+        <w:t>●</w:t>
       </w:r>
       <w:r>
         <w:rPr>
           <w:sz w:val="14"/>
           <w:szCs w:val="14"/>
-          <w:rtl w:val="0"/>
         </w:rPr>
         <w:t xml:space="preserve">        </w:t>
       </w:r>
       <w:r>
-        <w:rPr>
-          <w:rtl w:val="0"/>
-        </w:rPr>
-        <w:t xml:space="preserve">Avelino, Robert Emmanuel C.</w:t>
-      </w:r>
-      <w:r>
-        <w:rPr>
-          <w:rtl w:val="0"/>
-        </w:rPr>
-      </w:r>
-    </w:p>
-    <w:p>
-      <w:pPr>
-        <w:spacing w:after="240" w:lineRule="auto"/>
+        <w:t>Avelino, Robert Emmanuel C.</w:t>
+      </w:r>
+    </w:p>
+    <w:p>
+      <w:pPr>
+        <w:spacing w:after="240"/>
         <w:ind w:left="1080" w:hanging="360"/>
-        <w:rPr/>
-      </w:pPr>
-      <w:r>
-        <w:rPr>
-          <w:rtl w:val="0"/>
-        </w:rPr>
-        <w:t xml:space="preserve">●</w:t>
+      </w:pPr>
+      <w:r>
+        <w:t>●</w:t>
       </w:r>
       <w:r>
         <w:rPr>
           <w:sz w:val="14"/>
           <w:szCs w:val="14"/>
-          <w:rtl w:val="0"/>
         </w:rPr>
         <w:t xml:space="preserve">        </w:t>
       </w:r>
       <w:r>
-        <w:rPr>
-          <w:rtl w:val="0"/>
-        </w:rPr>
-        <w:t xml:space="preserve">Perez, Mel Stephen A.</w:t>
-      </w:r>
-      <w:r>
-        <w:rPr>
-          <w:rtl w:val="0"/>
-        </w:rPr>
+        <w:t>Perez, Mel Stephen A.</w:t>
       </w:r>
     </w:p>
     <w:p>
@@ -158,69 +126,81 @@
         <w:pStyle w:val="Heading1"/>
         <w:keepNext w:val="0"/>
         <w:keepLines w:val="0"/>
-        <w:spacing w:after="240" w:before="240" w:lineRule="auto"/>
-        <w:rPr>
-          <w:b w:val="1"/>
-          <w:bCs w:val="1"/>
+        <w:spacing w:before="240" w:after="240"/>
+        <w:rPr>
+          <w:b/>
+          <w:bCs/>
           <w:sz w:val="46"/>
           <w:szCs w:val="46"/>
         </w:rPr>
       </w:pPr>
-      <w:bookmarkStart w:colFirst="0" w:colLast="0" w:name="_hjivvfwakbpy" w:id="1"/>
+      <w:bookmarkStart w:id="1" w:name="_hjivvfwakbpy" w:colFirst="0" w:colLast="0"/>
       <w:bookmarkEnd w:id="1"/>
       <w:r>
         <w:rPr>
-          <w:b w:val="1"/>
-          <w:bCs w:val="1"/>
+          <w:b/>
+          <w:bCs/>
           <w:sz w:val="46"/>
           <w:szCs w:val="46"/>
-          <w:rtl w:val="0"/>
-        </w:rPr>
-        <w:t xml:space="preserve">MUST-HAVES</w:t>
-      </w:r>
-    </w:p>
-    <w:p>
-      <w:pPr>
-        <w:spacing w:after="240" w:before="240" w:lineRule="auto"/>
-        <w:jc w:val="both"/>
-        <w:rPr>
-          <w:b w:val="1"/>
-          <w:bCs w:val="1"/>
-        </w:rPr>
-      </w:pPr>
-      <w:r>
-        <w:rPr>
-          <w:b w:val="1"/>
-          <w:bCs w:val="1"/>
-          <w:rtl w:val="0"/>
-        </w:rPr>
-        <w:t xml:space="preserve">1. System-Wide Exam Lockdown (Windows API Level)</w:t>
-      </w:r>
-    </w:p>
-    <w:p>
-      <w:pPr>
-        <w:spacing w:after="240" w:before="240" w:lineRule="auto"/>
-        <w:jc w:val="both"/>
-        <w:rPr/>
-      </w:pPr>
-      <w:r>
-        <w:rPr>
-          <w:rtl w:val="0"/>
-        </w:rPr>
-        <w:t xml:space="preserve">When referring to OS-level lockdown in this project, the term describes system-wide input interception using low-level Windows API hooks, not kernel-driver programming. Specifically, the application uses SetWindowsHookEx with the WH_KEYBOARD_LL flag to intercept all keyboard input at the Windows message pipeline before any other application or shell component can act on it. This is the same technical approach used by commercial exam security browsers. It is implemented in userspace (Ring 3) and requires no kernel driver.</w:t>
-      </w:r>
-    </w:p>
-    <w:p>
-      <w:pPr>
-        <w:spacing w:after="240" w:before="240" w:lineRule="auto"/>
-        <w:jc w:val="both"/>
-        <w:rPr/>
-      </w:pPr>
-      <w:r>
-        <w:rPr>
-          <w:rtl w:val="0"/>
-        </w:rPr>
-        <w:t xml:space="preserve">What this lockdown covers:</w:t>
+        </w:rPr>
+        <w:t>MUST-HAVES</w:t>
+      </w:r>
+    </w:p>
+    <w:p>
+      <w:pPr>
+        <w:spacing w:before="240" w:after="240"/>
+        <w:jc w:val="both"/>
+        <w:rPr>
+          <w:b/>
+          <w:bCs/>
+        </w:rPr>
+      </w:pPr>
+      <w:r>
+        <w:rPr>
+          <w:b/>
+          <w:bCs/>
+        </w:rPr>
+        <w:t>1. System-Wide Exam Lockdown (Windows API Level)</w:t>
+      </w:r>
+    </w:p>
+    <w:p>
+      <w:pPr>
+        <w:spacing w:before="240" w:after="240"/>
+        <w:jc w:val="both"/>
+      </w:pPr>
+      <w:r>
+        <w:t>When referring to OS-level lockdown in this project, the term describes system-wide input interception using low-level Windows API hooks, not kernel-driver programming. Specifically, the applicati</w:t>
+      </w:r>
+      <w:r>
+        <w:t xml:space="preserve">on uses </w:t>
+      </w:r>
+      <w:proofErr w:type="spellStart"/>
+      <w:r>
+        <w:t>SetWindowsHookEx</w:t>
+      </w:r>
+      <w:proofErr w:type="spellEnd"/>
+      <w:r>
+        <w:t xml:space="preserve"> with the WH_KEYBOARD_LL flag to intercept all keyboard input at the Windows message pipeline before any other application or shell component can act on it. This is the same technical approach used by commercial exam security browse</w:t>
+      </w:r>
+      <w:r>
+        <w:t xml:space="preserve">rs. It is implemented in </w:t>
+      </w:r>
+      <w:proofErr w:type="spellStart"/>
+      <w:r>
+        <w:t>userspace</w:t>
+      </w:r>
+      <w:proofErr w:type="spellEnd"/>
+      <w:r>
+        <w:t xml:space="preserve"> (Ring 3) and requires no kernel driver.</w:t>
+      </w:r>
+    </w:p>
+    <w:p>
+      <w:pPr>
+        <w:spacing w:before="240" w:after="240"/>
+        <w:jc w:val="both"/>
+      </w:pPr>
+      <w:r>
+        <w:t>What this lockdown covers:</w:t>
       </w:r>
     </w:p>
     <w:p>
@@ -229,15 +209,11 @@
           <w:ilvl w:val="0"/>
           <w:numId w:val="6"/>
         </w:numPr>
-        <w:spacing w:after="0" w:afterAutospacing="0" w:before="240" w:lineRule="auto"/>
-        <w:ind w:left="720" w:hanging="360"/>
-        <w:jc w:val="both"/>
-      </w:pPr>
-      <w:r>
-        <w:rPr>
-          <w:rtl w:val="0"/>
-        </w:rPr>
-        <w:t xml:space="preserve">When the teacher starts an exam, lockdown activates simultaneously across all connected student machines</w:t>
+        <w:spacing w:before="240"/>
+        <w:jc w:val="both"/>
+      </w:pPr>
+      <w:r>
+        <w:t>When the teacher starts an exam, lockdown activates simultaneously across all connected student machines</w:t>
       </w:r>
     </w:p>
     <w:p>
@@ -246,15 +222,13 @@
           <w:ilvl w:val="0"/>
           <w:numId w:val="6"/>
         </w:numPr>
-        <w:spacing w:after="0" w:afterAutospacing="0" w:before="0" w:beforeAutospacing="0" w:lineRule="auto"/>
-        <w:ind w:left="720" w:hanging="360"/>
-        <w:jc w:val="both"/>
-      </w:pPr>
-      <w:r>
-        <w:rPr>
-          <w:rtl w:val="0"/>
-        </w:rPr>
-        <w:t xml:space="preserve">The following are intercepted and suppressed via low-level keyboard hooks:</w:t>
+        <w:jc w:val="both"/>
+      </w:pPr>
+      <w:r>
+        <w:t xml:space="preserve">The following are intercepted and suppressed via </w:t>
+      </w:r>
+      <w:r>
+        <w:t>low-level keyboard hooks:</w:t>
       </w:r>
     </w:p>
     <w:p>
@@ -263,15 +237,15 @@
           <w:ilvl w:val="1"/>
           <w:numId w:val="6"/>
         </w:numPr>
-        <w:spacing w:after="0" w:afterAutospacing="0" w:before="0" w:beforeAutospacing="0" w:lineRule="auto"/>
-        <w:ind w:left="1440" w:hanging="360"/>
-        <w:jc w:val="both"/>
-      </w:pPr>
-      <w:r>
-        <w:rPr>
-          <w:rtl w:val="0"/>
-        </w:rPr>
-        <w:t xml:space="preserve">Alt+Tab and all application-switching shortcuts</w:t>
+        <w:jc w:val="both"/>
+      </w:pPr>
+      <w:proofErr w:type="spellStart"/>
+      <w:r>
+        <w:t>Alt+Tab</w:t>
+      </w:r>
+      <w:proofErr w:type="spellEnd"/>
+      <w:r>
+        <w:t xml:space="preserve"> and all application-switching shortcuts</w:t>
       </w:r>
     </w:p>
     <w:p>
@@ -280,15 +254,10 @@
           <w:ilvl w:val="1"/>
           <w:numId w:val="6"/>
         </w:numPr>
-        <w:spacing w:after="0" w:afterAutospacing="0" w:before="0" w:beforeAutospacing="0" w:lineRule="auto"/>
-        <w:ind w:left="1440" w:hanging="360"/>
-        <w:jc w:val="both"/>
-      </w:pPr>
-      <w:r>
-        <w:rPr>
-          <w:rtl w:val="0"/>
-        </w:rPr>
-        <w:t xml:space="preserve">The Windows key and Start menu</w:t>
+        <w:jc w:val="both"/>
+      </w:pPr>
+      <w:r>
+        <w:t>The Windows key and Start menu</w:t>
       </w:r>
     </w:p>
     <w:p>
@@ -297,15 +266,26 @@
           <w:ilvl w:val="1"/>
           <w:numId w:val="6"/>
         </w:numPr>
-        <w:spacing w:after="0" w:afterAutospacing="0" w:before="0" w:beforeAutospacing="0" w:lineRule="auto"/>
-        <w:ind w:left="1440" w:hanging="360"/>
-        <w:jc w:val="both"/>
-      </w:pPr>
-      <w:r>
-        <w:rPr>
-          <w:rtl w:val="0"/>
-        </w:rPr>
-        <w:t xml:space="preserve">Task Manager (Ctrl+Shift+Esc and Ctrl+Alt+Del handling)</w:t>
+        <w:jc w:val="both"/>
+      </w:pPr>
+      <w:r>
+        <w:t>Task Manager (</w:t>
+      </w:r>
+      <w:proofErr w:type="spellStart"/>
+      <w:r>
+        <w:t>Ctrl+Shift+Esc</w:t>
+      </w:r>
+      <w:proofErr w:type="spellEnd"/>
+      <w:r>
+        <w:t xml:space="preserve"> and </w:t>
+      </w:r>
+      <w:proofErr w:type="spellStart"/>
+      <w:r>
+        <w:t>Ctrl+Alt+Del</w:t>
+      </w:r>
+      <w:proofErr w:type="spellEnd"/>
+      <w:r>
+        <w:t xml:space="preserve"> handling)</w:t>
       </w:r>
     </w:p>
     <w:p>
@@ -314,15 +294,34 @@
           <w:ilvl w:val="1"/>
           <w:numId w:val="6"/>
         </w:numPr>
-        <w:spacing w:after="0" w:afterAutospacing="0" w:before="0" w:beforeAutospacing="0" w:lineRule="auto"/>
-        <w:ind w:left="1440" w:hanging="360"/>
-        <w:jc w:val="both"/>
-      </w:pPr>
-      <w:r>
-        <w:rPr>
-          <w:rtl w:val="0"/>
-        </w:rPr>
-        <w:t xml:space="preserve">Copy-paste shortcuts (Ctrl+C, Ctrl+V, Ctrl+X)</w:t>
+        <w:jc w:val="both"/>
+      </w:pPr>
+      <w:r>
+        <w:t>Copy-paste shortcuts (</w:t>
+      </w:r>
+      <w:proofErr w:type="spellStart"/>
+      <w:r>
+        <w:t>Ctrl+C</w:t>
+      </w:r>
+      <w:proofErr w:type="spellEnd"/>
+      <w:r>
+        <w:t xml:space="preserve">, </w:t>
+      </w:r>
+      <w:proofErr w:type="spellStart"/>
+      <w:r>
+        <w:t>Ctrl+V</w:t>
+      </w:r>
+      <w:proofErr w:type="spellEnd"/>
+      <w:r>
+        <w:t xml:space="preserve">, </w:t>
+      </w:r>
+      <w:proofErr w:type="spellStart"/>
+      <w:r>
+        <w:t>Ctrl+X</w:t>
+      </w:r>
+      <w:proofErr w:type="spellEnd"/>
+      <w:r>
+        <w:t>)</w:t>
       </w:r>
     </w:p>
     <w:p>
@@ -331,15 +330,26 @@
           <w:ilvl w:val="1"/>
           <w:numId w:val="6"/>
         </w:numPr>
-        <w:spacing w:after="0" w:afterAutospacing="0" w:before="0" w:beforeAutospacing="0" w:lineRule="auto"/>
-        <w:ind w:left="1440" w:hanging="360"/>
-        <w:jc w:val="both"/>
-      </w:pPr>
-      <w:r>
-        <w:rPr>
-          <w:rtl w:val="0"/>
-        </w:rPr>
-        <w:t xml:space="preserve">Screenshot tools (PrintScreen, Win+Shift+S)</w:t>
+        <w:jc w:val="both"/>
+      </w:pPr>
+      <w:r>
+        <w:t>Screenshot tools (</w:t>
+      </w:r>
+      <w:proofErr w:type="spellStart"/>
+      <w:r>
+        <w:t>PrintScreen</w:t>
+      </w:r>
+      <w:proofErr w:type="spellEnd"/>
+      <w:r>
+        <w:t xml:space="preserve">, </w:t>
+      </w:r>
+      <w:proofErr w:type="spellStart"/>
+      <w:r>
+        <w:t>Win+Shift+S</w:t>
+      </w:r>
+      <w:proofErr w:type="spellEnd"/>
+      <w:r>
+        <w:t>)</w:t>
       </w:r>
     </w:p>
     <w:p>
@@ -348,15 +358,21 @@
           <w:ilvl w:val="0"/>
           <w:numId w:val="6"/>
         </w:numPr>
-        <w:spacing w:after="0" w:afterAutospacing="0" w:before="0" w:beforeAutospacing="0" w:lineRule="auto"/>
-        <w:ind w:left="720" w:hanging="360"/>
-        <w:jc w:val="both"/>
-      </w:pPr>
-      <w:r>
-        <w:rPr>
-          <w:rtl w:val="0"/>
-        </w:rPr>
-        <w:t xml:space="preserve">A fullscreen, always-on-top kiosk window captures focus so no background application can receive input</w:t>
+        <w:jc w:val="both"/>
+      </w:pPr>
+      <w:r>
+        <w:t xml:space="preserve">A </w:t>
+      </w:r>
+      <w:proofErr w:type="spellStart"/>
+      <w:r>
+        <w:t>ful</w:t>
+      </w:r>
+      <w:r>
+        <w:t>lscreen</w:t>
+      </w:r>
+      <w:proofErr w:type="spellEnd"/>
+      <w:r>
+        <w:t>, always-on-top kiosk window captures focus so no background application can receive input</w:t>
       </w:r>
     </w:p>
     <w:p>
@@ -365,15 +381,10 @@
           <w:ilvl w:val="0"/>
           <w:numId w:val="6"/>
         </w:numPr>
-        <w:spacing w:after="0" w:afterAutospacing="0" w:before="0" w:beforeAutospacing="0" w:lineRule="auto"/>
-        <w:ind w:left="720" w:hanging="360"/>
-        <w:jc w:val="both"/>
-      </w:pPr>
-      <w:r>
-        <w:rPr>
-          <w:rtl w:val="0"/>
-        </w:rPr>
-        <w:t xml:space="preserve">Active process monitoring detects and flags any attempt to open disallowed applications</w:t>
+        <w:jc w:val="both"/>
+      </w:pPr>
+      <w:r>
+        <w:t>Active process monitoring detects and flags any attempt to open disallowed applications</w:t>
       </w:r>
     </w:p>
     <w:p>
@@ -382,15 +393,10 @@
           <w:ilvl w:val="0"/>
           <w:numId w:val="6"/>
         </w:numPr>
-        <w:spacing w:after="0" w:afterAutospacing="0" w:before="0" w:beforeAutospacing="0" w:lineRule="auto"/>
-        <w:ind w:left="720" w:hanging="360"/>
-        <w:jc w:val="both"/>
-      </w:pPr>
-      <w:r>
-        <w:rPr>
-          <w:rtl w:val="0"/>
-        </w:rPr>
-        <w:t xml:space="preserve">Any bypass attempt is silently logged with a timestamp and flagged immediately on the teacher dashboard</w:t>
+        <w:jc w:val="both"/>
+      </w:pPr>
+      <w:r>
+        <w:t>Any bypass attempt is silently logged with a timestamp and flagged immediately on the teacher dashboard</w:t>
       </w:r>
     </w:p>
     <w:p>
@@ -399,46 +405,59 @@
           <w:ilvl w:val="0"/>
           <w:numId w:val="6"/>
         </w:numPr>
-        <w:spacing w:after="240" w:before="0" w:beforeAutospacing="0" w:lineRule="auto"/>
-        <w:ind w:left="720" w:hanging="360"/>
-        <w:jc w:val="both"/>
-      </w:pPr>
-      <w:r>
-        <w:rPr>
-          <w:rtl w:val="0"/>
-        </w:rPr>
-        <w:t xml:space="preserve">Lockdown is lifted only when the teacher explicitly ends the exam session</w:t>
-      </w:r>
-    </w:p>
-    <w:p>
-      <w:pPr>
-        <w:spacing w:after="240" w:before="240" w:lineRule="auto"/>
-        <w:jc w:val="both"/>
-        <w:rPr>
-          <w:b w:val="1"/>
-          <w:bCs w:val="1"/>
-        </w:rPr>
-      </w:pPr>
-      <w:r>
-        <w:rPr>
-          <w:b w:val="1"/>
-          <w:bCs w:val="1"/>
-          <w:rtl w:val="0"/>
-        </w:rPr>
-        <w:t xml:space="preserve">2. Live Teacher Monitoring Dashboard (Web-Based)</w:t>
-      </w:r>
-    </w:p>
-    <w:p>
-      <w:pPr>
-        <w:spacing w:after="240" w:before="240" w:lineRule="auto"/>
-        <w:jc w:val="both"/>
-        <w:rPr/>
-      </w:pPr>
-      <w:r>
-        <w:rPr>
-          <w:rtl w:val="0"/>
-        </w:rPr>
-        <w:t xml:space="preserve">The teacher dashboard runs in a web browser and is accessible through the cloud-based platform, providing real-time visibility into the entire exam session. It provides real-time visibility into the entire exam session.</w:t>
+        <w:spacing w:after="240"/>
+        <w:jc w:val="both"/>
+      </w:pPr>
+      <w:r>
+        <w:t xml:space="preserve">Lockdown is lifted </w:t>
+      </w:r>
+      <w:r>
+        <w:t>when the teacher explicitly ends the exam session</w:t>
+      </w:r>
+      <w:r>
+        <w:t xml:space="preserve"> or code exit</w:t>
+      </w:r>
+    </w:p>
+    <w:p>
+      <w:r>
+        <w:br w:type="page"/>
+      </w:r>
+    </w:p>
+    <w:p>
+      <w:pPr>
+        <w:spacing w:before="240" w:after="240"/>
+        <w:jc w:val="both"/>
+        <w:rPr>
+          <w:b/>
+          <w:bCs/>
+        </w:rPr>
+      </w:pPr>
+      <w:r>
+        <w:rPr>
+          <w:b/>
+          <w:bCs/>
+        </w:rPr>
+        <w:lastRenderedPageBreak/>
+        <w:t xml:space="preserve">2. </w:t>
+      </w:r>
+      <w:r>
+        <w:rPr>
+          <w:b/>
+          <w:bCs/>
+        </w:rPr>
+        <w:t>Teacher Monitoring Dashboard (Web-Based)</w:t>
+      </w:r>
+    </w:p>
+    <w:p>
+      <w:pPr>
+        <w:spacing w:before="240" w:after="240"/>
+        <w:jc w:val="both"/>
+      </w:pPr>
+      <w:r>
+        <w:t>The teacher dashboard runs in</w:t>
+      </w:r>
+      <w:r>
+        <w:t xml:space="preserve"> a web browser and is accessible through the cloud-based platform, providing real-time visibility into the entire exam session. It provides real-time visibility into the entire exam session.</w:t>
       </w:r>
     </w:p>
     <w:p>
@@ -447,15 +466,14 @@
           <w:ilvl w:val="0"/>
           <w:numId w:val="5"/>
         </w:numPr>
-        <w:spacing w:after="0" w:afterAutospacing="0" w:before="240" w:lineRule="auto"/>
-        <w:ind w:left="720" w:hanging="360"/>
-        <w:jc w:val="both"/>
-      </w:pPr>
-      <w:r>
-        <w:rPr>
-          <w:rtl w:val="0"/>
-        </w:rPr>
-        <w:t xml:space="preserve">Displays all connected students, their current question, and their progress status in real time</w:t>
+        <w:spacing w:before="240"/>
+        <w:jc w:val="both"/>
+      </w:pPr>
+      <w:r>
+        <w:t>Displays all connected students, their current question, and thei</w:t>
+      </w:r>
+      <w:r>
+        <w:t>r progress status in real time</w:t>
       </w:r>
     </w:p>
     <w:p>
@@ -464,15 +482,10 @@
           <w:ilvl w:val="0"/>
           <w:numId w:val="5"/>
         </w:numPr>
-        <w:spacing w:after="0" w:afterAutospacing="0" w:before="0" w:beforeAutospacing="0" w:lineRule="auto"/>
-        <w:ind w:left="720" w:hanging="360"/>
-        <w:jc w:val="both"/>
-      </w:pPr>
-      <w:r>
-        <w:rPr>
-          <w:rtl w:val="0"/>
-        </w:rPr>
-        <w:t xml:space="preserve">Violation alerts appear instantly showing the student name, violation type, and exact timestamp</w:t>
+        <w:jc w:val="both"/>
+      </w:pPr>
+      <w:r>
+        <w:t>Violation alerts appear instantly showing the student name, violation type, and exact timestamp</w:t>
       </w:r>
     </w:p>
     <w:p>
@@ -481,15 +494,10 @@
           <w:ilvl w:val="0"/>
           <w:numId w:val="5"/>
         </w:numPr>
-        <w:spacing w:after="0" w:afterAutospacing="0" w:before="0" w:beforeAutospacing="0" w:lineRule="auto"/>
-        <w:ind w:left="720" w:hanging="360"/>
-        <w:jc w:val="both"/>
-      </w:pPr>
-      <w:r>
-        <w:rPr>
-          <w:rtl w:val="0"/>
-        </w:rPr>
-        <w:t xml:space="preserve">Teacher can end the entire exam session or remove a specific student directly from the dashboard</w:t>
+        <w:jc w:val="both"/>
+      </w:pPr>
+      <w:r>
+        <w:t>Teacher can end the entire exam session or remove a specific student directly from the dashboard</w:t>
       </w:r>
     </w:p>
     <w:p>
@@ -498,15 +506,13 @@
           <w:ilvl w:val="0"/>
           <w:numId w:val="5"/>
         </w:numPr>
-        <w:spacing w:after="0" w:afterAutospacing="0" w:before="0" w:beforeAutospacing="0" w:lineRule="auto"/>
-        <w:ind w:left="720" w:hanging="360"/>
-        <w:jc w:val="both"/>
-      </w:pPr>
-      <w:r>
-        <w:rPr>
-          <w:rtl w:val="0"/>
-        </w:rPr>
-        <w:t xml:space="preserve">Student movement tracker logs every action taken during the exam, including question navigation, focus changes, and submission events</w:t>
+        <w:jc w:val="both"/>
+      </w:pPr>
+      <w:r>
+        <w:t>Student movement tracker logs ev</w:t>
+      </w:r>
+      <w:r>
+        <w:t>ery action taken during the exam, including question navigation, focus changes, and submission events</w:t>
       </w:r>
     </w:p>
     <w:p>
@@ -515,46 +521,44 @@
           <w:ilvl w:val="0"/>
           <w:numId w:val="5"/>
         </w:numPr>
-        <w:spacing w:after="240" w:before="0" w:beforeAutospacing="0" w:lineRule="auto"/>
-        <w:ind w:left="720" w:hanging="360"/>
-        <w:jc w:val="both"/>
-      </w:pPr>
-      <w:r>
-        <w:rPr>
-          <w:rtl w:val="0"/>
-        </w:rPr>
-        <w:t xml:space="preserve">Score analytics are displayed after the exam, including per-student breakdowns and question-level performance</w:t>
-      </w:r>
-    </w:p>
-    <w:p>
-      <w:pPr>
-        <w:spacing w:after="240" w:before="240" w:lineRule="auto"/>
-        <w:jc w:val="both"/>
-        <w:rPr>
-          <w:b w:val="1"/>
-          <w:bCs w:val="1"/>
-        </w:rPr>
-      </w:pPr>
-      <w:r>
-        <w:rPr>
-          <w:b w:val="1"/>
-          <w:bCs w:val="1"/>
-          <w:rtl w:val="0"/>
-        </w:rPr>
-        <w:t xml:space="preserve">3. Local Code Compiler and Automated Assessment Engine </w:t>
-      </w:r>
-    </w:p>
-    <w:p>
-      <w:pPr>
-        <w:spacing w:after="240" w:before="240" w:lineRule="auto"/>
-        <w:jc w:val="both"/>
-        <w:rPr/>
-      </w:pPr>
-      <w:r>
-        <w:rPr>
-          <w:rtl w:val="0"/>
-        </w:rPr>
-        <w:t xml:space="preserve">The platform runs its own code execution engine locally. No external grading API or internet connection is involved.</w:t>
+        <w:spacing w:after="240"/>
+        <w:jc w:val="both"/>
+      </w:pPr>
+      <w:r>
+        <w:t>Score analytics are displayed after the exam, including per-student breakdowns and question-level performance</w:t>
+      </w:r>
+    </w:p>
+    <w:p>
+      <w:pPr>
+        <w:spacing w:before="240" w:after="240"/>
+        <w:jc w:val="both"/>
+        <w:rPr>
+          <w:b/>
+          <w:bCs/>
+        </w:rPr>
+      </w:pPr>
+      <w:r>
+        <w:rPr>
+          <w:b/>
+          <w:bCs/>
+        </w:rPr>
+        <w:t>3. Local Code Compiler and Automated Assessm</w:t>
+      </w:r>
+      <w:r>
+        <w:rPr>
+          <w:b/>
+          <w:bCs/>
+        </w:rPr>
+        <w:t xml:space="preserve">ent Engine </w:t>
+      </w:r>
+    </w:p>
+    <w:p>
+      <w:pPr>
+        <w:spacing w:before="240" w:after="240"/>
+        <w:jc w:val="both"/>
+      </w:pPr>
+      <w:r>
+        <w:t>The platform runs its own code execution engine locally. No external grading API or internet connection is involved.</w:t>
       </w:r>
     </w:p>
     <w:p>
@@ -563,15 +567,17 @@
           <w:ilvl w:val="0"/>
           <w:numId w:val="3"/>
         </w:numPr>
-        <w:spacing w:after="0" w:afterAutospacing="0" w:before="240" w:lineRule="auto"/>
-        <w:ind w:left="720" w:hanging="360"/>
-        <w:jc w:val="both"/>
-      </w:pPr>
-      <w:r>
-        <w:rPr>
-          <w:rtl w:val="0"/>
-        </w:rPr>
-        <w:t xml:space="preserve">Supports C and Java using compiler and runtime tools pre-installed on the host machine (GCC for C, JDK for Java)</w:t>
+        <w:spacing w:before="240"/>
+        <w:jc w:val="both"/>
+      </w:pPr>
+      <w:r>
+        <w:t xml:space="preserve">Supports C </w:t>
+      </w:r>
+      <w:r>
+        <w:t>using compiler and runtime tools pre-installed on the host machine (GCC for C</w:t>
+      </w:r>
+      <w:r>
+        <w:t>)</w:t>
       </w:r>
     </w:p>
     <w:p>
@@ -580,15 +586,13 @@
           <w:ilvl w:val="0"/>
           <w:numId w:val="3"/>
         </w:numPr>
-        <w:spacing w:after="0" w:afterAutospacing="0" w:before="0" w:beforeAutospacing="0" w:lineRule="auto"/>
-        <w:ind w:left="720" w:hanging="360"/>
-        <w:jc w:val="both"/>
-      </w:pPr>
-      <w:r>
-        <w:rPr>
-          <w:rtl w:val="0"/>
-        </w:rPr>
-        <w:t xml:space="preserve">On submission, the engine compiles the student's code, runs it against hidden teacher-defined test cases, compares output, and returns a pass/fail result with partial credit scoring</w:t>
+        <w:jc w:val="both"/>
+      </w:pPr>
+      <w:r>
+        <w:t>On submission,</w:t>
+      </w:r>
+      <w:r>
+        <w:t xml:space="preserve"> the engine compiles the student's code, runs it against hidden teacher-defined test cases, compares output, and returns a pass/fail result with partial credit scoring</w:t>
       </w:r>
     </w:p>
     <w:p>
@@ -597,15 +601,13 @@
           <w:ilvl w:val="0"/>
           <w:numId w:val="3"/>
         </w:numPr>
-        <w:spacing w:after="0" w:afterAutospacing="0" w:before="0" w:beforeAutospacing="0" w:lineRule="auto"/>
-        <w:ind w:left="720" w:hanging="360"/>
-        <w:jc w:val="both"/>
-      </w:pPr>
-      <w:r>
-        <w:rPr>
-          <w:rtl w:val="0"/>
-        </w:rPr>
-        <w:t xml:space="preserve">Each execution runs in process isolation with a configurable time limit and automatic temporary file cleanup</w:t>
+        <w:jc w:val="both"/>
+      </w:pPr>
+      <w:r>
+        <w:t>Each execution runs in process isolation with a configurable time limit and automatic te</w:t>
+      </w:r>
+      <w:r>
+        <w:t>mporary file cleanup</w:t>
       </w:r>
     </w:p>
     <w:p>
@@ -614,46 +616,37 @@
           <w:ilvl w:val="0"/>
           <w:numId w:val="3"/>
         </w:numPr>
-        <w:spacing w:after="240" w:before="0" w:beforeAutospacing="0" w:lineRule="auto"/>
-        <w:ind w:left="720" w:hanging="360"/>
-        <w:jc w:val="both"/>
-      </w:pPr>
-      <w:r>
-        <w:rPr>
-          <w:rtl w:val="0"/>
-        </w:rPr>
-        <w:t xml:space="preserve">One student's submission cannot affect another's execution environment</w:t>
-      </w:r>
-    </w:p>
-    <w:p>
-      <w:pPr>
-        <w:spacing w:after="240" w:before="240" w:lineRule="auto"/>
-        <w:jc w:val="both"/>
-        <w:rPr>
-          <w:b w:val="1"/>
-          <w:bCs w:val="1"/>
-        </w:rPr>
-      </w:pPr>
-      <w:r>
-        <w:rPr>
-          <w:b w:val="1"/>
-          <w:bCs w:val="1"/>
-          <w:rtl w:val="0"/>
-        </w:rPr>
-        <w:t xml:space="preserve">4. Multi-Type Exam Builder</w:t>
-      </w:r>
-    </w:p>
-    <w:p>
-      <w:pPr>
-        <w:spacing w:after="240" w:before="240" w:lineRule="auto"/>
-        <w:jc w:val="both"/>
-        <w:rPr/>
-      </w:pPr>
-      <w:r>
-        <w:rPr>
-          <w:rtl w:val="0"/>
-        </w:rPr>
-        <w:t xml:space="preserve">Teachers build exams entirely through the web-based teacher portal. A single exam can combine any mix of the following question types:</w:t>
+        <w:spacing w:after="240"/>
+        <w:jc w:val="both"/>
+      </w:pPr>
+      <w:r>
+        <w:t>One student's submission cannot affect another's execution environment</w:t>
+      </w:r>
+    </w:p>
+    <w:p>
+      <w:pPr>
+        <w:spacing w:before="240" w:after="240"/>
+        <w:jc w:val="both"/>
+        <w:rPr>
+          <w:b/>
+          <w:bCs/>
+        </w:rPr>
+      </w:pPr>
+      <w:r>
+        <w:rPr>
+          <w:b/>
+          <w:bCs/>
+        </w:rPr>
+        <w:t>4. Multi-Type Exam Builder</w:t>
+      </w:r>
+    </w:p>
+    <w:p>
+      <w:pPr>
+        <w:spacing w:before="240" w:after="240"/>
+        <w:jc w:val="both"/>
+      </w:pPr>
+      <w:r>
+        <w:t>Teachers build exams entirely through the web-based teacher portal. A single exam can combine any mix of the following question types:</w:t>
       </w:r>
     </w:p>
     <w:p>
@@ -662,15 +655,11 @@
           <w:ilvl w:val="0"/>
           <w:numId w:val="8"/>
         </w:numPr>
-        <w:spacing w:after="0" w:afterAutospacing="0" w:before="240" w:lineRule="auto"/>
-        <w:ind w:left="720" w:hanging="360"/>
-        <w:jc w:val="both"/>
-      </w:pPr>
-      <w:r>
-        <w:rPr>
-          <w:rtl w:val="0"/>
-        </w:rPr>
-        <w:t xml:space="preserve">Multiple Choice</w:t>
+        <w:spacing w:before="240"/>
+        <w:jc w:val="both"/>
+      </w:pPr>
+      <w:r>
+        <w:t>Multiple Choice</w:t>
       </w:r>
     </w:p>
     <w:p>
@@ -679,15 +668,10 @@
           <w:ilvl w:val="0"/>
           <w:numId w:val="8"/>
         </w:numPr>
-        <w:spacing w:after="0" w:afterAutospacing="0" w:before="0" w:beforeAutospacing="0" w:lineRule="auto"/>
-        <w:ind w:left="720" w:hanging="360"/>
-        <w:jc w:val="both"/>
-      </w:pPr>
-      <w:r>
-        <w:rPr>
-          <w:rtl w:val="0"/>
-        </w:rPr>
-        <w:t xml:space="preserve">True or False</w:t>
+        <w:jc w:val="both"/>
+      </w:pPr>
+      <w:r>
+        <w:t>Fill-in-the-Blank</w:t>
       </w:r>
     </w:p>
     <w:p>
@@ -696,62 +680,20 @@
           <w:ilvl w:val="0"/>
           <w:numId w:val="8"/>
         </w:numPr>
-        <w:spacing w:after="0" w:afterAutospacing="0" w:before="0" w:beforeAutospacing="0" w:lineRule="auto"/>
-        <w:ind w:left="720" w:hanging="360"/>
-        <w:jc w:val="both"/>
-      </w:pPr>
-      <w:r>
-        <w:rPr>
-          <w:rtl w:val="0"/>
-        </w:rPr>
-        <w:t xml:space="preserve">Short Answer</w:t>
-      </w:r>
-    </w:p>
-    <w:p>
-      <w:pPr>
-        <w:numPr>
-          <w:ilvl w:val="0"/>
-          <w:numId w:val="8"/>
-        </w:numPr>
-        <w:spacing w:after="0" w:afterAutospacing="0" w:before="0" w:beforeAutospacing="0" w:lineRule="auto"/>
-        <w:ind w:left="720" w:hanging="360"/>
-        <w:jc w:val="both"/>
-      </w:pPr>
-      <w:r>
-        <w:rPr>
-          <w:rtl w:val="0"/>
-        </w:rPr>
-        <w:t xml:space="preserve">Fill-in-the-Blank</w:t>
-      </w:r>
-    </w:p>
-    <w:p>
-      <w:pPr>
-        <w:numPr>
-          <w:ilvl w:val="0"/>
-          <w:numId w:val="8"/>
-        </w:numPr>
-        <w:spacing w:after="240" w:before="0" w:beforeAutospacing="0" w:lineRule="auto"/>
-        <w:ind w:left="720" w:hanging="360"/>
-        <w:jc w:val="both"/>
-      </w:pPr>
-      <w:r>
-        <w:rPr>
-          <w:rtl w:val="0"/>
-        </w:rPr>
-        <w:t xml:space="preserve">Live Coding</w:t>
-      </w:r>
-    </w:p>
-    <w:p>
-      <w:pPr>
-        <w:spacing w:after="240" w:before="240" w:lineRule="auto"/>
-        <w:jc w:val="both"/>
-        <w:rPr/>
-      </w:pPr>
-      <w:r>
-        <w:rPr>
-          <w:rtl w:val="0"/>
-        </w:rPr>
-        <w:t xml:space="preserve">Additional exam builder features:</w:t>
+        <w:spacing w:after="240"/>
+        <w:jc w:val="both"/>
+      </w:pPr>
+      <w:r>
+        <w:t>Coding</w:t>
+      </w:r>
+    </w:p>
+    <w:p>
+      <w:pPr>
+        <w:spacing w:before="240" w:after="240"/>
+        <w:jc w:val="both"/>
+      </w:pPr>
+      <w:r>
+        <w:t>Additional exam builder features:</w:t>
       </w:r>
     </w:p>
     <w:p>
@@ -760,15 +702,11 @@
           <w:ilvl w:val="0"/>
           <w:numId w:val="9"/>
         </w:numPr>
-        <w:spacing w:after="0" w:afterAutospacing="0" w:before="240" w:lineRule="auto"/>
-        <w:ind w:left="720" w:hanging="360"/>
-        <w:jc w:val="both"/>
-      </w:pPr>
-      <w:r>
-        <w:rPr>
-          <w:rtl w:val="0"/>
-        </w:rPr>
-        <w:t xml:space="preserve">For coding questions, teachers define hidden test cases and expected outputs during setup. Students never see these.</w:t>
+        <w:spacing w:before="240"/>
+        <w:jc w:val="both"/>
+      </w:pPr>
+      <w:r>
+        <w:t>For coding questions, teachers define hidden test cases and expected outputs during setup. Students never see these.</w:t>
       </w:r>
     </w:p>
     <w:p>
@@ -777,15 +715,10 @@
           <w:ilvl w:val="0"/>
           <w:numId w:val="9"/>
         </w:numPr>
-        <w:spacing w:after="0" w:afterAutospacing="0" w:before="0" w:beforeAutospacing="0" w:lineRule="auto"/>
-        <w:ind w:left="720" w:hanging="360"/>
-        <w:jc w:val="both"/>
-      </w:pPr>
-      <w:r>
-        <w:rPr>
-          <w:rtl w:val="0"/>
-        </w:rPr>
-        <w:t xml:space="preserve">Question order can be randomized per student to reduce answer sharing</w:t>
+        <w:jc w:val="both"/>
+      </w:pPr>
+      <w:r>
+        <w:t>Question order can be randomized per student to reduce answer sharing</w:t>
       </w:r>
     </w:p>
     <w:p>
@@ -794,33 +727,29 @@
           <w:ilvl w:val="0"/>
           <w:numId w:val="9"/>
         </w:numPr>
-        <w:spacing w:after="240" w:before="0" w:beforeAutospacing="0" w:lineRule="auto"/>
-        <w:ind w:left="720" w:hanging="360"/>
-        <w:jc w:val="both"/>
-      </w:pPr>
-      <w:r>
-        <w:rPr>
-          <w:rtl w:val="0"/>
-        </w:rPr>
+        <w:spacing w:after="240"/>
+        <w:jc w:val="both"/>
+      </w:pPr>
+      <w:r>
+        <w:lastRenderedPageBreak/>
         <w:t xml:space="preserve">The teacher portal is web-based and accessible through the cloud-based platform from any authorized device. </w:t>
       </w:r>
     </w:p>
     <w:p>
       <w:pPr>
-        <w:spacing w:after="240" w:before="240" w:lineRule="auto"/>
-        <w:jc w:val="both"/>
-        <w:rPr>
-          <w:b w:val="1"/>
-          <w:bCs w:val="1"/>
-        </w:rPr>
-      </w:pPr>
-      <w:r>
-        <w:rPr>
-          <w:b w:val="1"/>
-          <w:bCs w:val="1"/>
-          <w:rtl w:val="0"/>
-        </w:rPr>
-        <w:t xml:space="preserve">5. In-App Code Editor for Students</w:t>
+        <w:spacing w:before="240" w:after="240"/>
+        <w:jc w:val="both"/>
+        <w:rPr>
+          <w:b/>
+          <w:bCs/>
+        </w:rPr>
+      </w:pPr>
+      <w:r>
+        <w:rPr>
+          <w:b/>
+          <w:bCs/>
+        </w:rPr>
+        <w:t>5. In-App Code Editor for Students</w:t>
       </w:r>
     </w:p>
     <w:p>
@@ -829,15 +758,14 @@
           <w:ilvl w:val="0"/>
           <w:numId w:val="10"/>
         </w:numPr>
-        <w:spacing w:after="0" w:afterAutospacing="0" w:before="240" w:lineRule="auto"/>
-        <w:ind w:left="720" w:hanging="360"/>
-        <w:jc w:val="both"/>
-      </w:pPr>
-      <w:r>
-        <w:rPr>
-          <w:rtl w:val="0"/>
-        </w:rPr>
-        <w:t xml:space="preserve">Students write and run code inside a built-in Monaco editor (the same engine powering Visual Studio Code) rendered within the locked application window</w:t>
+        <w:spacing w:before="240"/>
+        <w:jc w:val="both"/>
+      </w:pPr>
+      <w:r>
+        <w:t>Students write and run code inside a built</w:t>
+      </w:r>
+      <w:r>
+        <w:t>-in Monaco editor (the same engine powering Visual Studio Code) rendered within the locked application window</w:t>
       </w:r>
     </w:p>
     <w:p>
@@ -846,15 +774,10 @@
           <w:ilvl w:val="0"/>
           <w:numId w:val="10"/>
         </w:numPr>
-        <w:spacing w:after="0" w:afterAutospacing="0" w:before="0" w:beforeAutospacing="0" w:lineRule="auto"/>
-        <w:ind w:left="720" w:hanging="360"/>
-        <w:jc w:val="both"/>
-      </w:pPr>
-      <w:r>
-        <w:rPr>
-          <w:rtl w:val="0"/>
-        </w:rPr>
-        <w:t xml:space="preserve">Students can run their code against visible sample test cases before final submission</w:t>
+        <w:jc w:val="both"/>
+      </w:pPr>
+      <w:r>
+        <w:t>Students can run their code against visible sample test cases before final submission</w:t>
       </w:r>
     </w:p>
     <w:p>
@@ -863,33 +786,45 @@
           <w:ilvl w:val="0"/>
           <w:numId w:val="10"/>
         </w:numPr>
-        <w:spacing w:after="240" w:before="0" w:beforeAutospacing="0" w:lineRule="auto"/>
-        <w:ind w:left="720" w:hanging="360"/>
-        <w:jc w:val="both"/>
-      </w:pPr>
-      <w:r>
-        <w:rPr>
-          <w:rtl w:val="0"/>
-        </w:rPr>
-        <w:t xml:space="preserve">The editor is fully self-contained with no file system access, no external tools, and no browser access</w:t>
-      </w:r>
-    </w:p>
-    <w:p>
-      <w:pPr>
-        <w:spacing w:after="240" w:before="240" w:lineRule="auto"/>
-        <w:jc w:val="both"/>
-        <w:rPr>
-          <w:b w:val="1"/>
-          <w:bCs w:val="1"/>
-        </w:rPr>
-      </w:pPr>
-      <w:r>
-        <w:rPr>
-          <w:b w:val="1"/>
-          <w:bCs w:val="1"/>
-          <w:rtl w:val="0"/>
-        </w:rPr>
-        <w:t xml:space="preserve">6. Join by Class Code</w:t>
+        <w:spacing w:after="240"/>
+        <w:jc w:val="both"/>
+      </w:pPr>
+      <w:r>
+        <w:t>The editor is fully self-contained with no file system acces</w:t>
+      </w:r>
+      <w:r>
+        <w:t>s, no external tools, and no browser access</w:t>
+      </w:r>
+    </w:p>
+    <w:p>
+      <w:pPr>
+        <w:spacing w:before="240" w:after="240"/>
+        <w:jc w:val="both"/>
+        <w:rPr>
+          <w:b/>
+          <w:bCs/>
+        </w:rPr>
+      </w:pPr>
+      <w:r>
+        <w:rPr>
+          <w:b/>
+          <w:bCs/>
+        </w:rPr>
+        <w:t xml:space="preserve">6. Join by </w:t>
+      </w:r>
+      <w:r>
+        <w:rPr>
+          <w:b/>
+          <w:bCs/>
+        </w:rPr>
+        <w:t>Exam</w:t>
+      </w:r>
+      <w:r>
+        <w:rPr>
+          <w:b/>
+          <w:bCs/>
+        </w:rPr>
+        <w:t xml:space="preserve"> Code</w:t>
       </w:r>
     </w:p>
     <w:p>
@@ -898,14 +833,10 @@
           <w:ilvl w:val="0"/>
           <w:numId w:val="2"/>
         </w:numPr>
-        <w:spacing w:after="0" w:afterAutospacing="0" w:before="240" w:lineRule="auto"/>
-        <w:ind w:left="720" w:hanging="360"/>
-        <w:jc w:val="both"/>
-      </w:pPr>
-      <w:r>
-        <w:rPr>
-          <w:rtl w:val="0"/>
-        </w:rPr>
+        <w:spacing w:before="240"/>
+        <w:jc w:val="both"/>
+      </w:pPr>
+      <w:r>
         <w:t xml:space="preserve">Students join an exam by entering a single-use class code generated by the teacher through the cloud-based exam management system. </w:t>
       </w:r>
     </w:p>
@@ -915,31 +846,29 @@
           <w:ilvl w:val="0"/>
           <w:numId w:val="2"/>
         </w:numPr>
-        <w:spacing w:after="240" w:before="0" w:beforeAutospacing="0" w:lineRule="auto"/>
-        <w:ind w:left="720" w:hanging="360"/>
-        <w:jc w:val="both"/>
-      </w:pPr>
-      <w:r>
-        <w:rPr>
-          <w:rtl w:val="0"/>
-        </w:rPr>
-        <w:t xml:space="preserve">Once the exam ends, the session closes and the class code is invalidated automatically</w:t>
-      </w:r>
-    </w:p>
-    <w:p>
-      <w:pPr>
-        <w:spacing w:after="240" w:before="240" w:lineRule="auto"/>
-        <w:jc w:val="both"/>
-        <w:rPr>
-          <w:b w:val="1"/>
-          <w:bCs w:val="1"/>
-        </w:rPr>
-      </w:pPr>
-      <w:r>
-        <w:rPr>
-          <w:b w:val="1"/>
-          <w:bCs w:val="1"/>
-          <w:rtl w:val="0"/>
+        <w:spacing w:after="240"/>
+        <w:jc w:val="both"/>
+      </w:pPr>
+      <w:r>
+        <w:t xml:space="preserve">Once the exam ends, the session closes and the class code </w:t>
+      </w:r>
+      <w:r>
+        <w:t>is invalidated automatically</w:t>
+      </w:r>
+    </w:p>
+    <w:p>
+      <w:pPr>
+        <w:spacing w:before="240" w:after="240"/>
+        <w:jc w:val="both"/>
+        <w:rPr>
+          <w:b/>
+          <w:bCs/>
+        </w:rPr>
+      </w:pPr>
+      <w:r>
+        <w:rPr>
+          <w:b/>
+          <w:bCs/>
         </w:rPr>
         <w:t xml:space="preserve">7. Cloud-Based Data Storage and Centralized Management  </w:t>
       </w:r>
@@ -950,14 +879,10 @@
           <w:ilvl w:val="0"/>
           <w:numId w:val="1"/>
         </w:numPr>
-        <w:spacing w:after="0" w:afterAutospacing="0" w:before="240" w:lineRule="auto"/>
-        <w:ind w:left="720" w:hanging="360"/>
-        <w:jc w:val="both"/>
-      </w:pPr>
-      <w:r>
-        <w:rPr>
-          <w:rtl w:val="0"/>
-        </w:rPr>
+        <w:spacing w:before="240"/>
+        <w:jc w:val="both"/>
+      </w:pPr>
+      <w:r>
         <w:t xml:space="preserve">All exam data, including questions, student answers, scores, violation logs, and exam configurations, is stored in a secure cloud database </w:t>
       </w:r>
     </w:p>
@@ -967,14 +892,9 @@
           <w:ilvl w:val="0"/>
           <w:numId w:val="1"/>
         </w:numPr>
-        <w:spacing w:after="0" w:afterAutospacing="0" w:before="0" w:beforeAutospacing="0" w:lineRule="auto"/>
-        <w:ind w:left="720" w:hanging="360"/>
-        <w:jc w:val="both"/>
-      </w:pPr>
-      <w:r>
-        <w:rPr>
-          <w:rtl w:val="0"/>
-        </w:rPr>
+        <w:jc w:val="both"/>
+      </w:pPr>
+      <w:r>
         <w:t xml:space="preserve">Teachers can access and manage exams through their accounts from any authorized device with an internet connection </w:t>
       </w:r>
     </w:p>
@@ -984,15 +904,13 @@
           <w:ilvl w:val="0"/>
           <w:numId w:val="1"/>
         </w:numPr>
-        <w:spacing w:after="0" w:afterAutospacing="0" w:before="0" w:beforeAutospacing="0" w:lineRule="auto"/>
-        <w:ind w:left="720" w:hanging="360"/>
-        <w:jc w:val="both"/>
-      </w:pPr>
-      <w:r>
-        <w:rPr>
-          <w:rtl w:val="0"/>
-        </w:rPr>
-        <w:t xml:space="preserve">Student responses, progress updates, and assessment results are synchronized automatically in real time </w:t>
+        <w:jc w:val="both"/>
+      </w:pPr>
+      <w:r>
+        <w:t>Student responses, progress updates, and assessment results are synchronized</w:t>
+      </w:r>
+      <w:r>
+        <w:t>.</w:t>
       </w:r>
     </w:p>
     <w:p>
@@ -1001,15 +919,13 @@
           <w:ilvl w:val="0"/>
           <w:numId w:val="1"/>
         </w:numPr>
-        <w:spacing w:after="0" w:afterAutospacing="0" w:before="0" w:beforeAutospacing="0" w:lineRule="auto"/>
-        <w:ind w:left="720" w:hanging="360"/>
-        <w:jc w:val="both"/>
-      </w:pPr>
-      <w:r>
-        <w:rPr>
-          <w:rtl w:val="0"/>
-        </w:rPr>
-        <w:t xml:space="preserve">Data remains available after the exam ends and can be reviewed, exported, or reused for future assessments </w:t>
+        <w:jc w:val="both"/>
+      </w:pPr>
+      <w:r>
+        <w:t>Data remains available after the ex</w:t>
+      </w:r>
+      <w:r>
+        <w:t xml:space="preserve">am ends and can be reviewed, exported, or reused for future assessments </w:t>
       </w:r>
     </w:p>
     <w:p>
@@ -1018,33 +934,28 @@
           <w:ilvl w:val="0"/>
           <w:numId w:val="1"/>
         </w:numPr>
-        <w:spacing w:after="240" w:before="0" w:beforeAutospacing="0" w:lineRule="auto"/>
-        <w:ind w:left="720" w:hanging="360"/>
-        <w:jc w:val="both"/>
-      </w:pPr>
-      <w:r>
-        <w:rPr>
-          <w:rtl w:val="0"/>
-        </w:rPr>
+        <w:spacing w:after="240"/>
+        <w:jc w:val="both"/>
+      </w:pPr>
+      <w:r>
         <w:t xml:space="preserve">The platform maintains centralized ownership and management of examination records while reducing dependence on local machine storage </w:t>
       </w:r>
     </w:p>
     <w:p>
       <w:pPr>
-        <w:spacing w:after="240" w:before="240" w:lineRule="auto"/>
-        <w:jc w:val="both"/>
-        <w:rPr>
-          <w:b w:val="1"/>
-          <w:bCs w:val="1"/>
-        </w:rPr>
-      </w:pPr>
-      <w:r>
-        <w:rPr>
-          <w:b w:val="1"/>
-          <w:bCs w:val="1"/>
-          <w:rtl w:val="0"/>
-        </w:rPr>
-        <w:t xml:space="preserve">8. Result and Incident Report Export</w:t>
+        <w:spacing w:before="240" w:after="240"/>
+        <w:jc w:val="both"/>
+        <w:rPr>
+          <w:b/>
+          <w:bCs/>
+        </w:rPr>
+      </w:pPr>
+      <w:r>
+        <w:rPr>
+          <w:b/>
+          <w:bCs/>
+        </w:rPr>
+        <w:t>8. Result and Incident Report Export</w:t>
       </w:r>
     </w:p>
     <w:p>
@@ -1053,15 +964,14 @@
           <w:ilvl w:val="0"/>
           <w:numId w:val="7"/>
         </w:numPr>
-        <w:spacing w:after="0" w:afterAutospacing="0" w:before="240" w:lineRule="auto"/>
-        <w:ind w:left="720" w:hanging="360"/>
-        <w:jc w:val="both"/>
-      </w:pPr>
-      <w:r>
-        <w:rPr>
-          <w:rtl w:val="0"/>
-        </w:rPr>
-        <w:t xml:space="preserve">After the exam, the teacher can export a full results sheet as a CSV file and a formatted incident report as a PDF</w:t>
+        <w:spacing w:before="240"/>
+        <w:jc w:val="both"/>
+      </w:pPr>
+      <w:r>
+        <w:t>After the e</w:t>
+      </w:r>
+      <w:r>
+        <w:t>xam, the teacher can export a full results sheet as a CSV file</w:t>
       </w:r>
     </w:p>
     <w:p>
@@ -1070,15 +980,10 @@
           <w:ilvl w:val="0"/>
           <w:numId w:val="7"/>
         </w:numPr>
-        <w:spacing w:after="0" w:afterAutospacing="0" w:before="0" w:beforeAutospacing="0" w:lineRule="auto"/>
-        <w:ind w:left="720" w:hanging="360"/>
-        <w:jc w:val="both"/>
-      </w:pPr>
-      <w:r>
-        <w:rPr>
-          <w:rtl w:val="0"/>
-        </w:rPr>
-        <w:t xml:space="preserve">Results include per-student scores broken down by question</w:t>
+        <w:jc w:val="both"/>
+      </w:pPr>
+      <w:r>
+        <w:t>Results include per-student scores broken down by question</w:t>
       </w:r>
     </w:p>
     <w:p>
@@ -1087,15 +992,10 @@
           <w:ilvl w:val="0"/>
           <w:numId w:val="7"/>
         </w:numPr>
-        <w:spacing w:after="0" w:afterAutospacing="0" w:before="0" w:beforeAutospacing="0" w:lineRule="auto"/>
-        <w:ind w:left="720" w:hanging="360"/>
-        <w:jc w:val="both"/>
-      </w:pPr>
-      <w:r>
-        <w:rPr>
-          <w:rtl w:val="0"/>
-        </w:rPr>
-        <w:t xml:space="preserve">The incident report lists all logged violations with timestamps</w:t>
+        <w:jc w:val="both"/>
+      </w:pPr>
+      <w:r>
+        <w:t>The incident report lists all logged violations with timestamps</w:t>
       </w:r>
     </w:p>
     <w:p>
@@ -1104,31 +1004,29 @@
           <w:ilvl w:val="0"/>
           <w:numId w:val="7"/>
         </w:numPr>
-        <w:spacing w:after="240" w:before="0" w:beforeAutospacing="0" w:lineRule="auto"/>
-        <w:ind w:left="720" w:hanging="360"/>
-        <w:jc w:val="both"/>
-      </w:pPr>
-      <w:r>
-        <w:rPr>
-          <w:rtl w:val="0"/>
-        </w:rPr>
-        <w:t xml:space="preserve">Exports are generated immediately after the exam ends with no additional configuration</w:t>
-      </w:r>
-    </w:p>
-    <w:p>
-      <w:pPr>
-        <w:spacing w:after="240" w:before="240" w:lineRule="auto"/>
-        <w:jc w:val="both"/>
-        <w:rPr>
-          <w:b w:val="1"/>
-          <w:bCs w:val="1"/>
-        </w:rPr>
-      </w:pPr>
-      <w:r>
-        <w:rPr>
-          <w:b w:val="1"/>
-          <w:bCs w:val="1"/>
-          <w:rtl w:val="0"/>
+        <w:spacing w:after="240"/>
+        <w:jc w:val="both"/>
+      </w:pPr>
+      <w:r>
+        <w:t>Exports are generated immedia</w:t>
+      </w:r>
+      <w:r>
+        <w:t>tely after the exam ends with no additional configuration</w:t>
+      </w:r>
+    </w:p>
+    <w:p>
+      <w:pPr>
+        <w:spacing w:before="240" w:after="240"/>
+        <w:jc w:val="both"/>
+        <w:rPr>
+          <w:b/>
+          <w:bCs/>
+        </w:rPr>
+      </w:pPr>
+      <w:r>
+        <w:rPr>
+          <w:b/>
+          <w:bCs/>
         </w:rPr>
         <w:t xml:space="preserve">9. Cloud-Based Real-Time Synchronization </w:t>
       </w:r>
@@ -1139,14 +1037,10 @@
           <w:ilvl w:val="0"/>
           <w:numId w:val="4"/>
         </w:numPr>
-        <w:spacing w:after="0" w:afterAutospacing="0" w:before="240" w:lineRule="auto"/>
-        <w:ind w:left="720" w:hanging="360"/>
-        <w:jc w:val="both"/>
-      </w:pPr>
-      <w:r>
-        <w:rPr>
-          <w:rtl w:val="0"/>
-        </w:rPr>
+        <w:spacing w:before="240"/>
+        <w:jc w:val="both"/>
+      </w:pPr>
+      <w:r>
         <w:t xml:space="preserve">The platform uses cloud-hosted real-time communication services to synchronize exam activities across all connected devices </w:t>
       </w:r>
     </w:p>
@@ -1156,15 +1050,16 @@
           <w:ilvl w:val="0"/>
           <w:numId w:val="4"/>
         </w:numPr>
-        <w:spacing w:after="0" w:afterAutospacing="0" w:before="0" w:beforeAutospacing="0" w:lineRule="auto"/>
-        <w:ind w:left="720" w:hanging="360"/>
-        <w:jc w:val="both"/>
-      </w:pPr>
-      <w:r>
-        <w:rPr>
-          <w:rtl w:val="0"/>
-        </w:rPr>
-        <w:t xml:space="preserve">Exam delivery, student progress updates, violation alerts, and submission results are synchronized in near real time </w:t>
+        <w:jc w:val="both"/>
+      </w:pPr>
+      <w:r>
+        <w:t>Exam delivery, student progress</w:t>
+      </w:r>
+      <w:r>
+        <w:t xml:space="preserve"> updates, violation alerts, and submission results are synchronized in </w:t>
+      </w:r>
+      <w:r>
+        <w:t xml:space="preserve">real time </w:t>
       </w:r>
     </w:p>
     <w:p>
@@ -1173,15 +1068,10 @@
           <w:ilvl w:val="0"/>
           <w:numId w:val="4"/>
         </w:numPr>
-        <w:spacing w:after="0" w:afterAutospacing="0" w:before="0" w:beforeAutospacing="0" w:lineRule="auto"/>
-        <w:ind w:left="720" w:hanging="360"/>
-        <w:jc w:val="both"/>
-      </w:pPr>
-      <w:r>
-        <w:rPr>
-          <w:rtl w:val="0"/>
-        </w:rPr>
-        <w:t xml:space="preserve">Teachers receive live updates through the monitoring dashboard regardless of device location</w:t>
+        <w:jc w:val="both"/>
+      </w:pPr>
+      <w:r>
+        <w:t>Teachers receive live updates through the monitoring dashboard regardless of device location</w:t>
       </w:r>
     </w:p>
     <w:p>
@@ -1190,15 +1080,13 @@
           <w:ilvl w:val="0"/>
           <w:numId w:val="4"/>
         </w:numPr>
-        <w:spacing w:after="0" w:afterAutospacing="0" w:before="0" w:beforeAutospacing="0" w:lineRule="auto"/>
-        <w:ind w:left="720" w:hanging="360"/>
-        <w:jc w:val="both"/>
-      </w:pPr>
-      <w:r>
-        <w:rPr>
-          <w:rtl w:val="0"/>
-        </w:rPr>
-        <w:t xml:space="preserve">Local code compilation and assessment occur on the student machine, while synchronization and result reporting are handled through the cloud </w:t>
+        <w:jc w:val="both"/>
+      </w:pPr>
+      <w:r>
+        <w:t>Local code compilation and assessment occur on the student machine, while sy</w:t>
+      </w:r>
+      <w:r>
+        <w:t xml:space="preserve">nchronization and result reporting are handled through the cloud </w:t>
       </w:r>
     </w:p>
     <w:p>
@@ -1207,31 +1095,33 @@
           <w:ilvl w:val="0"/>
           <w:numId w:val="4"/>
         </w:numPr>
-        <w:spacing w:after="240" w:before="0" w:beforeAutospacing="0" w:lineRule="auto"/>
-        <w:ind w:left="720" w:hanging="360"/>
-        <w:jc w:val="both"/>
-      </w:pPr>
-      <w:r>
-        <w:rPr>
-          <w:rtl w:val="0"/>
-        </w:rPr>
+        <w:spacing w:after="240"/>
+        <w:jc w:val="both"/>
+        <w:rPr>
+          <w:highlight w:val="red"/>
+        </w:rPr>
+      </w:pPr>
+      <w:r>
+        <w:rPr>
+          <w:highlight w:val="red"/>
+        </w:rPr>
+        <w:lastRenderedPageBreak/>
         <w:t xml:space="preserve">The system remains responsive by limiting network traffic to exam data and synchronization events rather than code execution tasks </w:t>
       </w:r>
     </w:p>
     <w:p>
       <w:pPr>
-        <w:spacing w:after="240" w:before="240" w:lineRule="auto"/>
-        <w:jc w:val="both"/>
-        <w:rPr>
-          <w:b w:val="1"/>
-          <w:bCs w:val="1"/>
-        </w:rPr>
-      </w:pPr>
-      <w:r>
-        <w:rPr>
-          <w:b w:val="1"/>
-          <w:bCs w:val="1"/>
-          <w:rtl w:val="0"/>
+        <w:spacing w:before="240" w:after="240"/>
+        <w:jc w:val="both"/>
+        <w:rPr>
+          <w:b/>
+          <w:bCs/>
+        </w:rPr>
+      </w:pPr>
+      <w:r>
+        <w:rPr>
+          <w:b/>
+          <w:bCs/>
         </w:rPr>
         <w:t xml:space="preserve">10. Guided Installation and Deployment Package </w:t>
       </w:r>
@@ -1242,15 +1132,11 @@
           <w:ilvl w:val="0"/>
           <w:numId w:val="11"/>
         </w:numPr>
-        <w:spacing w:after="0" w:afterAutospacing="0" w:before="240" w:lineRule="auto"/>
-        <w:ind w:left="720" w:hanging="360"/>
-        <w:jc w:val="both"/>
-      </w:pPr>
-      <w:r>
-        <w:rPr>
-          <w:rtl w:val="0"/>
-        </w:rPr>
-        <w:t xml:space="preserve">The platform is distributed as an installer package with a guided setup wizard for both teachers and students</w:t>
+        <w:spacing w:before="240"/>
+        <w:jc w:val="both"/>
+      </w:pPr>
+      <w:r>
+        <w:t>The platform is distributed as an installer package with a guided setup wizard for both teachers and students</w:t>
       </w:r>
     </w:p>
     <w:p>
@@ -1259,15 +1145,10 @@
           <w:ilvl w:val="0"/>
           <w:numId w:val="11"/>
         </w:numPr>
-        <w:spacing w:after="0" w:afterAutospacing="0" w:before="0" w:beforeAutospacing="0" w:lineRule="auto"/>
-        <w:ind w:left="720" w:hanging="360"/>
-        <w:jc w:val="both"/>
-      </w:pPr>
-      <w:r>
-        <w:rPr>
-          <w:rtl w:val="0"/>
-        </w:rPr>
-        <w:t xml:space="preserve">The installer automatically configures required application components and dependencies</w:t>
+        <w:jc w:val="both"/>
+      </w:pPr>
+      <w:r>
+        <w:t>The installer automatically configures required application components and dependencies</w:t>
       </w:r>
     </w:p>
     <w:p>
@@ -1276,15 +1157,13 @@
           <w:ilvl w:val="0"/>
           <w:numId w:val="11"/>
         </w:numPr>
-        <w:spacing w:after="0" w:afterAutospacing="0" w:before="0" w:beforeAutospacing="0" w:lineRule="auto"/>
-        <w:ind w:left="720" w:hanging="360"/>
-        <w:jc w:val="both"/>
-      </w:pPr>
-      <w:r>
-        <w:rPr>
-          <w:rtl w:val="0"/>
-        </w:rPr>
-        <w:t xml:space="preserve">Teachers can install the desktop application and access the web-based management portal after setup</w:t>
+        <w:jc w:val="both"/>
+      </w:pPr>
+      <w:r>
+        <w:t>Teachers can install the desktop application and access th</w:t>
+      </w:r>
+      <w:r>
+        <w:t>e web-based management portal after setup</w:t>
       </w:r>
     </w:p>
     <w:p>
@@ -1293,15 +1172,10 @@
           <w:ilvl w:val="0"/>
           <w:numId w:val="11"/>
         </w:numPr>
-        <w:spacing w:after="0" w:afterAutospacing="0" w:before="0" w:beforeAutospacing="0" w:lineRule="auto"/>
-        <w:ind w:left="720" w:hanging="360"/>
-        <w:jc w:val="both"/>
-      </w:pPr>
-      <w:r>
-        <w:rPr>
-          <w:rtl w:val="0"/>
-        </w:rPr>
-        <w:t xml:space="preserve">Students can install the application through a standard installation process without manual configuration</w:t>
+        <w:jc w:val="both"/>
+      </w:pPr>
+      <w:r>
+        <w:t>Students can install the application through a standard installation process without manual configuration</w:t>
       </w:r>
     </w:p>
     <w:p>
@@ -1310,15 +1184,13 @@
           <w:ilvl w:val="0"/>
           <w:numId w:val="11"/>
         </w:numPr>
-        <w:spacing w:after="0" w:afterAutospacing="0" w:before="0" w:beforeAutospacing="0" w:lineRule="auto"/>
-        <w:ind w:left="720" w:hanging="360"/>
-        <w:jc w:val="both"/>
-      </w:pPr>
-      <w:r>
-        <w:rPr>
-          <w:rtl w:val="0"/>
-        </w:rPr>
-        <w:t xml:space="preserve">The installation package verifies required software components for supported programming languages and provides setup instructions when dependencies are missing</w:t>
+        <w:jc w:val="both"/>
+      </w:pPr>
+      <w:r>
+        <w:t>The installation package verifies required software components for supported programming languages and provi</w:t>
+      </w:r>
+      <w:r>
+        <w:t>des setup instructions when dependencies are missing</w:t>
       </w:r>
     </w:p>
     <w:p>
@@ -1327,310 +1199,242 @@
           <w:ilvl w:val="0"/>
           <w:numId w:val="11"/>
         </w:numPr>
-        <w:spacing w:after="240" w:before="0" w:beforeAutospacing="0" w:lineRule="auto"/>
-        <w:ind w:left="720" w:hanging="360"/>
-        <w:jc w:val="both"/>
-      </w:pPr>
-      <w:r>
-        <w:rPr>
-          <w:rtl w:val="0"/>
-        </w:rPr>
-        <w:t xml:space="preserve">Application updates can be deployed through future installer releases without requiring manual reconfiguration</w:t>
-      </w:r>
-      <w:r>
-        <w:rPr>
-          <w:rtl w:val="0"/>
-        </w:rPr>
-      </w:r>
+        <w:spacing w:after="240"/>
+        <w:jc w:val="both"/>
+      </w:pPr>
+      <w:r>
+        <w:t>Application updates can be deployed through future installer releases without requiring manual reconfiguration</w:t>
+      </w:r>
+    </w:p>
+    <w:p>
+      <w:pPr>
+        <w:spacing w:after="240"/>
+        <w:jc w:val="both"/>
+        <w:rPr>
+          <w:color w:val="FF0000"/>
+        </w:rPr>
+      </w:pPr>
+      <w:proofErr w:type="spellStart"/>
+      <w:r>
+        <w:rPr>
+          <w:color w:val="FF0000"/>
+        </w:rPr>
+        <w:t>Kuwang</w:t>
+      </w:r>
+      <w:proofErr w:type="spellEnd"/>
+      <w:r>
+        <w:rPr>
+          <w:color w:val="FF0000"/>
+        </w:rPr>
+        <w:t xml:space="preserve"> ang code making </w:t>
+      </w:r>
+      <w:proofErr w:type="spellStart"/>
+      <w:r>
+        <w:rPr>
+          <w:color w:val="FF0000"/>
+        </w:rPr>
+        <w:t>sa</w:t>
+      </w:r>
+      <w:proofErr w:type="spellEnd"/>
+      <w:r>
+        <w:rPr>
+          <w:color w:val="FF0000"/>
+        </w:rPr>
+        <w:t xml:space="preserve"> teacher </w:t>
+      </w:r>
+      <w:proofErr w:type="spellStart"/>
+      <w:r>
+        <w:rPr>
+          <w:color w:val="FF0000"/>
+        </w:rPr>
+        <w:t>nga</w:t>
+      </w:r>
+      <w:proofErr w:type="spellEnd"/>
+      <w:r>
+        <w:rPr>
+          <w:color w:val="FF0000"/>
+        </w:rPr>
+        <w:t xml:space="preserve"> side</w:t>
+      </w:r>
+    </w:p>
+    <w:p>
+      <w:pPr>
+        <w:spacing w:after="240"/>
+        <w:jc w:val="both"/>
+        <w:rPr>
+          <w:color w:val="FF0000"/>
+        </w:rPr>
+      </w:pPr>
+      <w:proofErr w:type="spellStart"/>
+      <w:r>
+        <w:rPr>
+          <w:color w:val="FF0000"/>
+        </w:rPr>
+        <w:t>Ilahi</w:t>
+      </w:r>
+      <w:proofErr w:type="spellEnd"/>
+      <w:r>
+        <w:rPr>
+          <w:color w:val="FF0000"/>
+        </w:rPr>
+        <w:t xml:space="preserve"> ang web and software must haves</w:t>
+      </w:r>
+      <w:bookmarkStart w:id="2" w:name="_GoBack"/>
+      <w:bookmarkEnd w:id="2"/>
     </w:p>
     <w:p>
       <w:pPr>
         <w:pStyle w:val="Heading1"/>
         <w:keepNext w:val="0"/>
         <w:keepLines w:val="0"/>
-        <w:spacing w:after="240" w:before="240" w:lineRule="auto"/>
-        <w:rPr>
-          <w:b w:val="1"/>
-          <w:bCs w:val="1"/>
+        <w:spacing w:before="240" w:after="240"/>
+        <w:rPr>
+          <w:b/>
+          <w:bCs/>
           <w:sz w:val="46"/>
           <w:szCs w:val="46"/>
         </w:rPr>
       </w:pPr>
-      <w:bookmarkStart w:colFirst="0" w:colLast="0" w:name="_n5btw09eqrxe" w:id="2"/>
-      <w:bookmarkEnd w:id="2"/>
-      <w:r>
-        <w:rPr>
-          <w:b w:val="1"/>
-          <w:bCs w:val="1"/>
+      <w:bookmarkStart w:id="3" w:name="_n5btw09eqrxe" w:colFirst="0" w:colLast="0"/>
+      <w:bookmarkEnd w:id="3"/>
+      <w:r>
+        <w:rPr>
+          <w:b/>
+          <w:bCs/>
           <w:sz w:val="46"/>
           <w:szCs w:val="46"/>
-          <w:rtl w:val="0"/>
-        </w:rPr>
-        <w:t xml:space="preserve">NICE-TO-HAVE</w:t>
-      </w:r>
-    </w:p>
-    <w:p>
-      <w:pPr>
-        <w:ind w:left="1080" w:hanging="360"/>
-        <w:rPr/>
-      </w:pPr>
-      <w:r>
-        <w:rPr>
-          <w:rtl w:val="0"/>
-        </w:rPr>
-        <w:t xml:space="preserve">●</w:t>
-      </w:r>
-      <w:r>
-        <w:rPr>
-          <w:sz w:val="14"/>
-          <w:szCs w:val="14"/>
-          <w:rtl w:val="0"/>
-        </w:rPr>
-        <w:t xml:space="preserve">     </w:t>
-      </w:r>
-      <w:r>
-        <w:rPr>
-          <w:rtl w:val="0"/>
-        </w:rPr>
-        <w:t xml:space="preserve"> Student Exam Review Mode: Allow students to review their submitted answers and the correct answers after the teacher releases results, without re-enabling lockdown</w:t>
-      </w:r>
-    </w:p>
-    <w:p>
-      <w:pPr>
-        <w:ind w:left="1080" w:hanging="360"/>
-        <w:rPr/>
-      </w:pPr>
-      <w:r>
-        <w:rPr>
-          <w:rtl w:val="0"/>
-        </w:rPr>
-        <w:t xml:space="preserve">●</w:t>
-      </w:r>
-      <w:r>
-        <w:rPr>
-          <w:sz w:val="14"/>
-          <w:szCs w:val="14"/>
-          <w:rtl w:val="0"/>
-        </w:rPr>
-        <w:t xml:space="preserve">     </w:t>
-      </w:r>
-      <w:r>
-        <w:rPr>
-          <w:rtl w:val="0"/>
-        </w:rPr>
-        <w:t xml:space="preserve"> Exam Timer with Auto-Submit: Enforce a per-exam time limit with a visible countdown on the student side. Automatically submit whatever the student has answered when time runs out.</w:t>
-      </w:r>
-    </w:p>
-    <w:p>
-      <w:pPr>
-        <w:ind w:left="1080" w:hanging="360"/>
-        <w:rPr/>
-      </w:pPr>
-      <w:r>
-        <w:rPr>
-          <w:rtl w:val="0"/>
-        </w:rPr>
-        <w:t xml:space="preserve">●</w:t>
-      </w:r>
-      <w:r>
-        <w:rPr>
-          <w:sz w:val="14"/>
-          <w:szCs w:val="14"/>
-          <w:rtl w:val="0"/>
-        </w:rPr>
-        <w:t xml:space="preserve">     </w:t>
-      </w:r>
-      <w:r>
-        <w:rPr>
-          <w:rtl w:val="0"/>
-        </w:rPr>
-        <w:t xml:space="preserve"> Dark Mode for Student Interface: Reduce eye strain during long coding exams with an optional dark theme for the Monaco editor and surrounding UI</w:t>
-      </w:r>
-    </w:p>
-    <w:p>
-      <w:pPr>
-        <w:rPr>
-          <w:b w:val="1"/>
-          <w:bCs w:val="1"/>
-        </w:rPr>
-      </w:pPr>
-      <w:r>
-        <w:rPr>
-          <w:rtl w:val="0"/>
-        </w:rPr>
-      </w:r>
-    </w:p>
-    <w:p>
-      <w:pPr>
-        <w:rPr>
-          <w:b w:val="1"/>
-          <w:bCs w:val="1"/>
-        </w:rPr>
-      </w:pPr>
-      <w:r>
-        <w:rPr>
-          <w:b w:val="1"/>
-          <w:bCs w:val="1"/>
-          <w:rtl w:val="0"/>
-        </w:rPr>
-        <w:t xml:space="preserve">PROJECT ADVISOR</w:t>
-      </w:r>
-    </w:p>
-    <w:p>
-      <w:pPr>
-        <w:rPr/>
-      </w:pPr>
-      <w:r>
-        <w:rPr>
-          <w:rtl w:val="0"/>
-        </w:rPr>
-        <w:t xml:space="preserve">Engr. Violdan Bayocot</w:t>
-      </w:r>
-    </w:p>
-    <w:p>
-      <w:pPr>
-        <w:rPr/>
-      </w:pPr>
-      <w:r>
-        <w:rPr>
-          <w:rtl w:val="0"/>
-        </w:rPr>
-      </w:r>
-    </w:p>
-    <w:p>
-      <w:pPr>
-        <w:rPr>
-          <w:b w:val="1"/>
-          <w:bCs w:val="1"/>
-        </w:rPr>
-      </w:pPr>
-      <w:r>
-        <w:rPr>
-          <w:b w:val="1"/>
-          <w:bCs w:val="1"/>
-          <w:rtl w:val="0"/>
-        </w:rPr>
-        <w:t xml:space="preserve">PROJECT COORDINATOR</w:t>
-      </w:r>
-    </w:p>
-    <w:p>
-      <w:pPr>
-        <w:rPr/>
-      </w:pPr>
-      <w:r>
-        <w:rPr>
-          <w:rtl w:val="0"/>
-        </w:rPr>
-        <w:t xml:space="preserve">Engr. Alyssa Joyce Tan</w:t>
-      </w:r>
-      <w:r>
-        <w:rPr>
-          <w:rtl w:val="0"/>
-        </w:rPr>
-      </w:r>
-    </w:p>
-    <w:p>
-      <w:pPr>
-        <w:rPr/>
-      </w:pPr>
-      <w:r>
-        <w:rPr>
-          <w:rtl w:val="0"/>
-        </w:rPr>
-      </w:r>
-    </w:p>
-    <w:p>
-      <w:pPr>
-        <w:rPr/>
-      </w:pPr>
-      <w:r>
-        <w:rPr>
-          <w:b w:val="1"/>
-          <w:bCs w:val="1"/>
-          <w:rtl w:val="0"/>
-        </w:rPr>
-        <w:t xml:space="preserve">CHAIRMAN OF THE PANEL</w:t>
-      </w:r>
-      <w:r>
-        <w:rPr>
-          <w:rtl w:val="0"/>
-        </w:rPr>
-      </w:r>
-    </w:p>
-    <w:p>
-      <w:pPr>
-        <w:rPr/>
-      </w:pPr>
-      <w:r>
-        <w:rPr>
-          <w:rtl w:val="0"/>
-        </w:rPr>
-      </w:r>
-    </w:p>
-    <w:p>
-      <w:pPr>
-        <w:rPr/>
-      </w:pPr>
-      <w:r>
-        <w:rPr>
-          <w:rtl w:val="0"/>
-        </w:rPr>
-      </w:r>
-    </w:p>
-    <w:p>
-      <w:pPr>
-        <w:rPr>
-          <w:b w:val="1"/>
-          <w:bCs w:val="1"/>
-        </w:rPr>
-      </w:pPr>
-      <w:r>
-        <w:rPr>
-          <w:b w:val="1"/>
-          <w:bCs w:val="1"/>
-          <w:rtl w:val="0"/>
-        </w:rPr>
-        <w:t xml:space="preserve">PANELIST</w:t>
-      </w:r>
-    </w:p>
-    <w:p>
-      <w:pPr>
-        <w:rPr>
-          <w:b w:val="1"/>
-          <w:bCs w:val="1"/>
-        </w:rPr>
-      </w:pPr>
-      <w:r>
-        <w:rPr>
-          <w:rtl w:val="0"/>
-        </w:rPr>
-      </w:r>
-    </w:p>
-    <w:p>
-      <w:pPr>
-        <w:rPr>
-          <w:b w:val="1"/>
-          <w:bCs w:val="1"/>
-        </w:rPr>
-      </w:pPr>
-      <w:r>
-        <w:rPr>
-          <w:rtl w:val="0"/>
-        </w:rPr>
-      </w:r>
+        </w:rPr>
+        <w:t>NICE-TO-HAVE</w:t>
+      </w:r>
+    </w:p>
+    <w:p>
+      <w:pPr>
+        <w:rPr>
+          <w:b/>
+          <w:bCs/>
+        </w:rPr>
+      </w:pPr>
+    </w:p>
+    <w:p>
+      <w:pPr>
+        <w:rPr>
+          <w:b/>
+          <w:bCs/>
+        </w:rPr>
+      </w:pPr>
+      <w:r>
+        <w:rPr>
+          <w:b/>
+          <w:bCs/>
+        </w:rPr>
+        <w:t>PROJECT</w:t>
+      </w:r>
+      <w:r>
+        <w:rPr>
+          <w:b/>
+          <w:bCs/>
+        </w:rPr>
+        <w:t xml:space="preserve"> ADVISOR</w:t>
+      </w:r>
+    </w:p>
+    <w:p>
+      <w:r>
+        <w:t xml:space="preserve">Engr. </w:t>
+      </w:r>
+      <w:proofErr w:type="spellStart"/>
+      <w:r>
+        <w:t>Violdan</w:t>
+      </w:r>
+      <w:proofErr w:type="spellEnd"/>
+      <w:r>
+        <w:t xml:space="preserve"> </w:t>
+      </w:r>
+      <w:proofErr w:type="spellStart"/>
+      <w:r>
+        <w:t>Bayocot</w:t>
+      </w:r>
+      <w:proofErr w:type="spellEnd"/>
+    </w:p>
+    <w:p/>
+    <w:p>
+      <w:pPr>
+        <w:rPr>
+          <w:b/>
+          <w:bCs/>
+        </w:rPr>
+      </w:pPr>
+      <w:r>
+        <w:rPr>
+          <w:b/>
+          <w:bCs/>
+        </w:rPr>
+        <w:t>PROJECT COORDINATOR</w:t>
+      </w:r>
+    </w:p>
+    <w:p>
+      <w:r>
+        <w:t>Engr. Alyssa Joyce Tan</w:t>
+      </w:r>
+    </w:p>
+    <w:p/>
+    <w:p>
+      <w:r>
+        <w:rPr>
+          <w:b/>
+          <w:bCs/>
+        </w:rPr>
+        <w:t>CHAIRMAN OF THE PANEL</w:t>
+      </w:r>
+    </w:p>
+    <w:p/>
+    <w:p/>
+    <w:p>
+      <w:pPr>
+        <w:rPr>
+          <w:b/>
+          <w:bCs/>
+        </w:rPr>
+      </w:pPr>
+      <w:r>
+        <w:rPr>
+          <w:b/>
+          <w:bCs/>
+        </w:rPr>
+        <w:t>PANELIST</w:t>
+      </w:r>
+    </w:p>
+    <w:p>
+      <w:pPr>
+        <w:rPr>
+          <w:b/>
+          <w:bCs/>
+        </w:rPr>
+      </w:pPr>
+    </w:p>
+    <w:p>
+      <w:pPr>
+        <w:rPr>
+          <w:b/>
+          <w:bCs/>
+        </w:rPr>
+      </w:pPr>
     </w:p>
     <w:sectPr>
-      <w:pgSz w:h="15840" w:w="12240" w:orient="portrait"/>
-      <w:pgMar w:bottom="1440" w:top="1440" w:left="1440" w:right="1440" w:header="720" w:footer="720"/>
+      <w:pgSz w:w="12240" w:h="15840"/>
+      <w:pgMar w:top="1440" w:right="1440" w:bottom="1440" w:left="1440" w:header="720" w:footer="720" w:gutter="0"/>
       <w:pgNumType w:start="1"/>
+      <w:cols w:space="720"/>
     </w:sectPr>
   </w:body>
 </w:document>
 </file>
 
 <file path=word/numbering.xml><?xml version="1.0" encoding="utf-8"?>
-<w:numbering xmlns:mc="http://schemas.openxmlformats.org/markup-compatibility/2006" xmlns:o="urn:schemas-microsoft-com:office:office" xmlns:r="http://schemas.openxmlformats.org/officeDocument/2006/relationships" xmlns:m="http://schemas.openxmlformats.org/officeDocument/2006/math" xmlns:v="urn:schemas-microsoft-com:vml" xmlns:wp="http://schemas.openxmlformats.org/drawingml/2006/wordprocessingDrawing" xmlns:w10="urn:schemas-microsoft-com:office:word" xmlns:w="http://schemas.openxmlformats.org/wordprocessingml/2006/main" xmlns:wne="http://schemas.microsoft.com/office/word/2006/wordml" xmlns:sl="http://schemas.openxmlformats.org/schemaLibrary/2006/main" xmlns:a="http://schemas.openxmlformats.org/drawingml/2006/main" xmlns:pic="http://schemas.openxmlformats.org/drawingml/2006/picture" xmlns:c="http://schemas.openxmlformats.org/drawingml/2006/chart" xmlns:lc="http://schemas.openxmlformats.org/drawingml/2006/lockedCanvas" xmlns:dgm="http://schemas.openxmlformats.org/drawingml/2006/diagram" xmlns:wps="http://schemas.microsoft.com/office/word/2010/wordprocessingShape" xmlns:wpg="http://schemas.microsoft.com/office/word/2010/wordprocessingGroup" xmlns:w14="http://schemas.microsoft.com/office/word/2010/wordml" xmlns:w15="http://schemas.microsoft.com/office/word/2012/wordml" xmlns:w16="http://schemas.microsoft.com/office/word/2018/wordml" xmlns:w16cex="http://schemas.microsoft.com/office/word/2018/wordml/cex" xmlns:w16cid="http://schemas.microsoft.com/office/word/2016/wordml/cid" xmlns="http://schemas.microsoft.com/office/tasks/2019/documenttasks" xmlns:cr="http://schemas.microsoft.com/office/comments/2020/reactions">
-  <w:abstractNum w:abstractNumId="1">
+<w:numbering xmlns:wpc="http://schemas.microsoft.com/office/word/2010/wordprocessingCanvas" xmlns:cx="http://schemas.microsoft.com/office/drawing/2014/chartex" xmlns:cx1="http://schemas.microsoft.com/office/drawing/2015/9/8/chartex" xmlns:cx2="http://schemas.microsoft.com/office/drawing/2015/10/21/chartex" xmlns:cx3="http://schemas.microsoft.com/office/drawing/2016/5/9/chartex" xmlns:cx4="http://schemas.microsoft.com/office/drawing/2016/5/10/chartex" xmlns:cx5="http://schemas.microsoft.com/office/drawing/2016/5/11/chartex" xmlns:cx6="http://schemas.microsoft.com/office/drawing/2016/5/12/chartex" xmlns:cx7="http://schemas.microsoft.com/office/drawing/2016/5/13/chartex" xmlns:cx8="http://schemas.microsoft.com/office/drawing/2016/5/14/chartex" xmlns:mc="http://schemas.openxmlformats.org/markup-compatibility/2006" xmlns:aink="http://schemas.microsoft.com/office/drawing/2016/ink" xmlns:am3d="http://schemas.microsoft.com/office/drawing/2017/model3d" xmlns:o="urn:schemas-microsoft-com:office:office" xmlns:r="http://schemas.openxmlformats.org/officeDocument/2006/relationships" xmlns:m="http://schemas.openxmlformats.org/officeDocument/2006/math" xmlns:v="urn:schemas-microsoft-com:vml" xmlns:wp14="http://schemas.microsoft.com/office/word/2010/wordprocessingDrawing" xmlns:wp="http://schemas.openxmlformats.org/drawingml/2006/wordprocessingDrawing" xmlns:w10="urn:schemas-microsoft-com:office:word" xmlns:w="http://schemas.openxmlformats.org/wordprocessingml/2006/main" xmlns:w14="http://schemas.microsoft.com/office/word/2010/wordml" xmlns:w15="http://schemas.microsoft.com/office/word/2012/wordml" xmlns:w16cid="http://schemas.microsoft.com/office/word/2016/wordml/cid" xmlns:w16se="http://schemas.microsoft.com/office/word/2015/wordml/symex" xmlns:wpg="http://schemas.microsoft.com/office/word/2010/wordprocessingGroup" xmlns:wpi="http://schemas.microsoft.com/office/word/2010/wordprocessingInk" xmlns:wne="http://schemas.microsoft.com/office/word/2006/wordml" xmlns:wps="http://schemas.microsoft.com/office/word/2010/wordprocessingShape" mc:Ignorable="w14 w15 w16se w16cid wp14">
+  <w:abstractNum w:abstractNumId="0" w15:restartNumberingAfterBreak="0">
+    <w:nsid w:val="01AC5A12"/>
+    <w:multiLevelType w:val="multilevel"/>
+    <w:tmpl w:val="5C12B32A"/>
     <w:lvl w:ilvl="0">
       <w:start w:val="1"/>
       <w:numFmt w:val="bullet"/>
@@ -1740,7 +1544,10 @@
       </w:rPr>
     </w:lvl>
   </w:abstractNum>
-  <w:abstractNum w:abstractNumId="2">
+  <w:abstractNum w:abstractNumId="1" w15:restartNumberingAfterBreak="0">
+    <w:nsid w:val="07463E08"/>
+    <w:multiLevelType w:val="multilevel"/>
+    <w:tmpl w:val="E6725F12"/>
     <w:lvl w:ilvl="0">
       <w:start w:val="1"/>
       <w:numFmt w:val="bullet"/>
@@ -1850,7 +1657,10 @@
       </w:rPr>
     </w:lvl>
   </w:abstractNum>
-  <w:abstractNum w:abstractNumId="3">
+  <w:abstractNum w:abstractNumId="2" w15:restartNumberingAfterBreak="0">
+    <w:nsid w:val="0A5767A8"/>
+    <w:multiLevelType w:val="multilevel"/>
+    <w:tmpl w:val="C85E5E54"/>
     <w:lvl w:ilvl="0">
       <w:start w:val="1"/>
       <w:numFmt w:val="bullet"/>
@@ -1960,7 +1770,10 @@
       </w:rPr>
     </w:lvl>
   </w:abstractNum>
-  <w:abstractNum w:abstractNumId="4">
+  <w:abstractNum w:abstractNumId="3" w15:restartNumberingAfterBreak="0">
+    <w:nsid w:val="0D900F30"/>
+    <w:multiLevelType w:val="multilevel"/>
+    <w:tmpl w:val="AB7EAF3C"/>
     <w:lvl w:ilvl="0">
       <w:start w:val="1"/>
       <w:numFmt w:val="bullet"/>
@@ -2070,7 +1883,10 @@
       </w:rPr>
     </w:lvl>
   </w:abstractNum>
-  <w:abstractNum w:abstractNumId="5">
+  <w:abstractNum w:abstractNumId="4" w15:restartNumberingAfterBreak="0">
+    <w:nsid w:val="35C3349B"/>
+    <w:multiLevelType w:val="multilevel"/>
+    <w:tmpl w:val="A950F0AA"/>
     <w:lvl w:ilvl="0">
       <w:start w:val="1"/>
       <w:numFmt w:val="bullet"/>
@@ -2180,7 +1996,10 @@
       </w:rPr>
     </w:lvl>
   </w:abstractNum>
-  <w:abstractNum w:abstractNumId="6">
+  <w:abstractNum w:abstractNumId="5" w15:restartNumberingAfterBreak="0">
+    <w:nsid w:val="390B1929"/>
+    <w:multiLevelType w:val="multilevel"/>
+    <w:tmpl w:val="E496E9E4"/>
     <w:lvl w:ilvl="0">
       <w:start w:val="1"/>
       <w:numFmt w:val="bullet"/>
@@ -2290,7 +2109,10 @@
       </w:rPr>
     </w:lvl>
   </w:abstractNum>
-  <w:abstractNum w:abstractNumId="7">
+  <w:abstractNum w:abstractNumId="6" w15:restartNumberingAfterBreak="0">
+    <w:nsid w:val="397204EC"/>
+    <w:multiLevelType w:val="multilevel"/>
+    <w:tmpl w:val="F2F07EFE"/>
     <w:lvl w:ilvl="0">
       <w:start w:val="1"/>
       <w:numFmt w:val="bullet"/>
@@ -2400,7 +2222,10 @@
       </w:rPr>
     </w:lvl>
   </w:abstractNum>
-  <w:abstractNum w:abstractNumId="8">
+  <w:abstractNum w:abstractNumId="7" w15:restartNumberingAfterBreak="0">
+    <w:nsid w:val="39E66B13"/>
+    <w:multiLevelType w:val="multilevel"/>
+    <w:tmpl w:val="08F2AC9C"/>
     <w:lvl w:ilvl="0">
       <w:start w:val="1"/>
       <w:numFmt w:val="bullet"/>
@@ -2510,7 +2335,10 @@
       </w:rPr>
     </w:lvl>
   </w:abstractNum>
-  <w:abstractNum w:abstractNumId="9">
+  <w:abstractNum w:abstractNumId="8" w15:restartNumberingAfterBreak="0">
+    <w:nsid w:val="3EA804A3"/>
+    <w:multiLevelType w:val="multilevel"/>
+    <w:tmpl w:val="1CEA89A4"/>
     <w:lvl w:ilvl="0">
       <w:start w:val="1"/>
       <w:numFmt w:val="bullet"/>
@@ -2620,7 +2448,10 @@
       </w:rPr>
     </w:lvl>
   </w:abstractNum>
-  <w:abstractNum w:abstractNumId="10">
+  <w:abstractNum w:abstractNumId="9" w15:restartNumberingAfterBreak="0">
+    <w:nsid w:val="5BDE10B0"/>
+    <w:multiLevelType w:val="multilevel"/>
+    <w:tmpl w:val="DA302504"/>
     <w:lvl w:ilvl="0">
       <w:start w:val="1"/>
       <w:numFmt w:val="bullet"/>
@@ -2730,7 +2561,10 @@
       </w:rPr>
     </w:lvl>
   </w:abstractNum>
-  <w:abstractNum w:abstractNumId="11">
+  <w:abstractNum w:abstractNumId="10" w15:restartNumberingAfterBreak="0">
+    <w:nsid w:val="789D62CC"/>
+    <w:multiLevelType w:val="multilevel"/>
+    <w:tmpl w:val="0118322C"/>
     <w:lvl w:ilvl="0">
       <w:start w:val="1"/>
       <w:numFmt w:val="bullet"/>
@@ -2841,50 +2675,50 @@
     </w:lvl>
   </w:abstractNum>
   <w:num w:numId="1">
+    <w:abstractNumId w:val="6"/>
+  </w:num>
+  <w:num w:numId="2">
+    <w:abstractNumId w:val="7"/>
+  </w:num>
+  <w:num w:numId="3">
+    <w:abstractNumId w:val="5"/>
+  </w:num>
+  <w:num w:numId="4">
+    <w:abstractNumId w:val="8"/>
+  </w:num>
+  <w:num w:numId="5">
+    <w:abstractNumId w:val="0"/>
+  </w:num>
+  <w:num w:numId="6">
+    <w:abstractNumId w:val="10"/>
+  </w:num>
+  <w:num w:numId="7">
+    <w:abstractNumId w:val="2"/>
+  </w:num>
+  <w:num w:numId="8">
+    <w:abstractNumId w:val="3"/>
+  </w:num>
+  <w:num w:numId="9">
     <w:abstractNumId w:val="1"/>
   </w:num>
-  <w:num w:numId="2">
-    <w:abstractNumId w:val="2"/>
-  </w:num>
-  <w:num w:numId="3">
-    <w:abstractNumId w:val="3"/>
-  </w:num>
-  <w:num w:numId="4">
-    <w:abstractNumId w:val="4"/>
-  </w:num>
-  <w:num w:numId="5">
-    <w:abstractNumId w:val="5"/>
-  </w:num>
-  <w:num w:numId="6">
-    <w:abstractNumId w:val="6"/>
-  </w:num>
-  <w:num w:numId="7">
-    <w:abstractNumId w:val="7"/>
-  </w:num>
-  <w:num w:numId="8">
-    <w:abstractNumId w:val="8"/>
-  </w:num>
-  <w:num w:numId="9">
+  <w:num w:numId="10">
     <w:abstractNumId w:val="9"/>
   </w:num>
-  <w:num w:numId="10">
-    <w:abstractNumId w:val="10"/>
-  </w:num>
   <w:num w:numId="11">
-    <w:abstractNumId w:val="11"/>
+    <w:abstractNumId w:val="4"/>
   </w:num>
 </w:numbering>
 </file>
 
 <file path=word/styles.xml><?xml version="1.0" encoding="utf-8"?>
-<w:styles xmlns:mc="http://schemas.openxmlformats.org/markup-compatibility/2006" xmlns:o="urn:schemas-microsoft-com:office:office" xmlns:r="http://schemas.openxmlformats.org/officeDocument/2006/relationships" xmlns:m="http://schemas.openxmlformats.org/officeDocument/2006/math" xmlns:v="urn:schemas-microsoft-com:vml" xmlns:wp="http://schemas.openxmlformats.org/drawingml/2006/wordprocessingDrawing" xmlns:w10="urn:schemas-microsoft-com:office:word" xmlns:w="http://schemas.openxmlformats.org/wordprocessingml/2006/main" xmlns:wne="http://schemas.microsoft.com/office/word/2006/wordml" xmlns:sl="http://schemas.openxmlformats.org/schemaLibrary/2006/main" xmlns:a="http://schemas.openxmlformats.org/drawingml/2006/main" xmlns:pic="http://schemas.openxmlformats.org/drawingml/2006/picture" xmlns:c="http://schemas.openxmlformats.org/drawingml/2006/chart" xmlns:lc="http://schemas.openxmlformats.org/drawingml/2006/lockedCanvas" xmlns:dgm="http://schemas.openxmlformats.org/drawingml/2006/diagram" xmlns:wps="http://schemas.microsoft.com/office/word/2010/wordprocessingShape" xmlns:wpg="http://schemas.microsoft.com/office/word/2010/wordprocessingGroup" xmlns:w14="http://schemas.microsoft.com/office/word/2010/wordml" xmlns:w15="http://schemas.microsoft.com/office/word/2012/wordml" xmlns:w16="http://schemas.microsoft.com/office/word/2018/wordml" xmlns:w16cex="http://schemas.microsoft.com/office/word/2018/wordml/cex" xmlns:w16cid="http://schemas.microsoft.com/office/word/2016/wordml/cid" xmlns="http://schemas.microsoft.com/office/tasks/2019/documenttasks" xmlns:cr="http://schemas.microsoft.com/office/comments/2020/reactions">
+<w:styles xmlns:mc="http://schemas.openxmlformats.org/markup-compatibility/2006" xmlns:r="http://schemas.openxmlformats.org/officeDocument/2006/relationships" xmlns:w="http://schemas.openxmlformats.org/wordprocessingml/2006/main" xmlns:w14="http://schemas.microsoft.com/office/word/2010/wordml" xmlns:w15="http://schemas.microsoft.com/office/word/2012/wordml" xmlns:w16cid="http://schemas.microsoft.com/office/word/2016/wordml/cid" xmlns:w16se="http://schemas.microsoft.com/office/word/2015/wordml/symex" mc:Ignorable="w14 w15 w16se w16cid">
   <w:docDefaults>
     <w:rPrDefault>
       <w:rPr>
-        <w:rFonts w:ascii="Arial" w:cs="Arial" w:eastAsia="Arial" w:hAnsi="Arial"/>
+        <w:rFonts w:ascii="Arial" w:eastAsia="Arial" w:hAnsi="Arial" w:cs="Arial"/>
         <w:sz w:val="22"/>
         <w:szCs w:val="22"/>
-        <w:lang w:val="en"/>
+        <w:lang w:val="en" w:eastAsia="en-PH" w:bidi="ar-SA"/>
       </w:rPr>
     </w:rPrDefault>
     <w:pPrDefault>
@@ -2893,29 +2727,398 @@
       </w:pPr>
     </w:pPrDefault>
   </w:docDefaults>
-  <w:style w:type="table" w:styleId="TableNormal" w:default="1">
-    <w:name w:val="TableNormal"/>
-    <w:tblPr>
-      <w:tblCellMar>
-        <w:top w:w="100.0" w:type="dxa"/>
-        <w:left w:w="100.0" w:type="dxa"/>
-        <w:bottom w:w="100.0" w:type="dxa"/>
-        <w:right w:w="100.0" w:type="dxa"/>
-      </w:tblCellMar>
-    </w:tblPr>
-  </w:style>
-  <w:style w:type="paragraph" w:styleId="Normal" w:default="1">
-    <w:name w:val="normal"/>
+  <w:latentStyles w:defLockedState="0" w:defUIPriority="99" w:defSemiHidden="0" w:defUnhideWhenUsed="0" w:defQFormat="0" w:count="375">
+    <w:lsdException w:name="Normal" w:uiPriority="0" w:qFormat="1"/>
+    <w:lsdException w:name="heading 1" w:uiPriority="9" w:qFormat="1"/>
+    <w:lsdException w:name="heading 2" w:semiHidden="1" w:uiPriority="9" w:unhideWhenUsed="1" w:qFormat="1"/>
+    <w:lsdException w:name="heading 3" w:semiHidden="1" w:uiPriority="9" w:unhideWhenUsed="1" w:qFormat="1"/>
+    <w:lsdException w:name="heading 4" w:semiHidden="1" w:uiPriority="9" w:unhideWhenUsed="1" w:qFormat="1"/>
+    <w:lsdException w:name="heading 5" w:semiHidden="1" w:uiPriority="9" w:unhideWhenUsed="1" w:qFormat="1"/>
+    <w:lsdException w:name="heading 6" w:semiHidden="1" w:uiPriority="9" w:unhideWhenUsed="1" w:qFormat="1"/>
+    <w:lsdException w:name="heading 7" w:semiHidden="1" w:uiPriority="9" w:unhideWhenUsed="1" w:qFormat="1"/>
+    <w:lsdException w:name="heading 8" w:semiHidden="1" w:uiPriority="9" w:unhideWhenUsed="1" w:qFormat="1"/>
+    <w:lsdException w:name="heading 9" w:semiHidden="1" w:uiPriority="9" w:unhideWhenUsed="1" w:qFormat="1"/>
+    <w:lsdException w:name="index 1" w:semiHidden="1" w:unhideWhenUsed="1"/>
+    <w:lsdException w:name="index 2" w:semiHidden="1" w:unhideWhenUsed="1"/>
+    <w:lsdException w:name="index 3" w:semiHidden="1" w:unhideWhenUsed="1"/>
+    <w:lsdException w:name="index 4" w:semiHidden="1" w:unhideWhenUsed="1"/>
+    <w:lsdException w:name="index 5" w:semiHidden="1" w:unhideWhenUsed="1"/>
+    <w:lsdException w:name="index 6" w:semiHidden="1" w:unhideWhenUsed="1"/>
+    <w:lsdException w:name="index 7" w:semiHidden="1" w:unhideWhenUsed="1"/>
+    <w:lsdException w:name="index 8" w:semiHidden="1" w:unhideWhenUsed="1"/>
+    <w:lsdException w:name="index 9" w:semiHidden="1" w:unhideWhenUsed="1"/>
+    <w:lsdException w:name="toc 1" w:semiHidden="1" w:uiPriority="39" w:unhideWhenUsed="1"/>
+    <w:lsdException w:name="toc 2" w:semiHidden="1" w:uiPriority="39" w:unhideWhenUsed="1"/>
+    <w:lsdException w:name="toc 3" w:semiHidden="1" w:uiPriority="39" w:unhideWhenUsed="1"/>
+    <w:lsdException w:name="toc 4" w:semiHidden="1" w:uiPriority="39" w:unhideWhenUsed="1"/>
+    <w:lsdException w:name="toc 5" w:semiHidden="1" w:uiPriority="39" w:unhideWhenUsed="1"/>
+    <w:lsdException w:name="toc 6" w:semiHidden="1" w:uiPriority="39" w:unhideWhenUsed="1"/>
+    <w:lsdException w:name="toc 7" w:semiHidden="1" w:uiPriority="39" w:unhideWhenUsed="1"/>
+    <w:lsdException w:name="toc 8" w:semiHidden="1" w:uiPriority="39" w:unhideWhenUsed="1"/>
+    <w:lsdException w:name="toc 9" w:semiHidden="1" w:uiPriority="39" w:unhideWhenUsed="1"/>
+    <w:lsdException w:name="Normal Indent" w:semiHidden="1" w:unhideWhenUsed="1"/>
+    <w:lsdException w:name="footnote text" w:semiHidden="1" w:unhideWhenUsed="1"/>
+    <w:lsdException w:name="annotation text" w:semiHidden="1" w:unhideWhenUsed="1"/>
+    <w:lsdException w:name="header" w:semiHidden="1" w:unhideWhenUsed="1"/>
+    <w:lsdException w:name="footer" w:semiHidden="1" w:unhideWhenUsed="1"/>
+    <w:lsdException w:name="index heading" w:semiHidden="1" w:unhideWhenUsed="1"/>
+    <w:lsdException w:name="caption" w:semiHidden="1" w:uiPriority="35" w:unhideWhenUsed="1" w:qFormat="1"/>
+    <w:lsdException w:name="table of figures" w:semiHidden="1" w:unhideWhenUsed="1"/>
+    <w:lsdException w:name="envelope address" w:semiHidden="1" w:unhideWhenUsed="1"/>
+    <w:lsdException w:name="envelope return" w:semiHidden="1" w:unhideWhenUsed="1"/>
+    <w:lsdException w:name="footnote reference" w:semiHidden="1" w:unhideWhenUsed="1"/>
+    <w:lsdException w:name="annotation reference" w:semiHidden="1" w:unhideWhenUsed="1"/>
+    <w:lsdException w:name="line number" w:semiHidden="1" w:unhideWhenUsed="1"/>
+    <w:lsdException w:name="page number" w:semiHidden="1" w:unhideWhenUsed="1"/>
+    <w:lsdException w:name="endnote reference" w:semiHidden="1" w:unhideWhenUsed="1"/>
+    <w:lsdException w:name="endnote text" w:semiHidden="1" w:unhideWhenUsed="1"/>
+    <w:lsdException w:name="table of authorities" w:semiHidden="1" w:unhideWhenUsed="1"/>
+    <w:lsdException w:name="macro" w:semiHidden="1" w:unhideWhenUsed="1"/>
+    <w:lsdException w:name="toa heading" w:semiHidden="1" w:unhideWhenUsed="1"/>
+    <w:lsdException w:name="List" w:semiHidden="1" w:unhideWhenUsed="1"/>
+    <w:lsdException w:name="List Bullet" w:semiHidden="1" w:unhideWhenUsed="1"/>
+    <w:lsdException w:name="List Number" w:semiHidden="1" w:unhideWhenUsed="1"/>
+    <w:lsdException w:name="List 2" w:semiHidden="1" w:unhideWhenUsed="1"/>
+    <w:lsdException w:name="List 3" w:semiHidden="1" w:unhideWhenUsed="1"/>
+    <w:lsdException w:name="List 4" w:semiHidden="1" w:unhideWhenUsed="1"/>
+    <w:lsdException w:name="List 5" w:semiHidden="1" w:unhideWhenUsed="1"/>
+    <w:lsdException w:name="List Bullet 2" w:semiHidden="1" w:unhideWhenUsed="1"/>
+    <w:lsdException w:name="List Bullet 3" w:semiHidden="1" w:unhideWhenUsed="1"/>
+    <w:lsdException w:name="List Bullet 4" w:semiHidden="1" w:unhideWhenUsed="1"/>
+    <w:lsdException w:name="List Bullet 5" w:semiHidden="1" w:unhideWhenUsed="1"/>
+    <w:lsdException w:name="List Number 2" w:semiHidden="1" w:unhideWhenUsed="1"/>
+    <w:lsdException w:name="List Number 3" w:semiHidden="1" w:unhideWhenUsed="1"/>
+    <w:lsdException w:name="List Number 4" w:semiHidden="1" w:unhideWhenUsed="1"/>
+    <w:lsdException w:name="List Number 5" w:semiHidden="1" w:unhideWhenUsed="1"/>
+    <w:lsdException w:name="Title" w:uiPriority="10" w:qFormat="1"/>
+    <w:lsdException w:name="Closing" w:semiHidden="1" w:unhideWhenUsed="1"/>
+    <w:lsdException w:name="Signature" w:semiHidden="1" w:unhideWhenUsed="1"/>
+    <w:lsdException w:name="Default Paragraph Font" w:semiHidden="1" w:uiPriority="1" w:unhideWhenUsed="1"/>
+    <w:lsdException w:name="Body Text" w:semiHidden="1" w:unhideWhenUsed="1"/>
+    <w:lsdException w:name="Body Text Indent" w:semiHidden="1" w:unhideWhenUsed="1"/>
+    <w:lsdException w:name="List Continue" w:semiHidden="1" w:unhideWhenUsed="1"/>
+    <w:lsdException w:name="List Continue 2" w:semiHidden="1" w:unhideWhenUsed="1"/>
+    <w:lsdException w:name="List Continue 3" w:semiHidden="1" w:unhideWhenUsed="1"/>
+    <w:lsdException w:name="List Continue 4" w:semiHidden="1" w:unhideWhenUsed="1"/>
+    <w:lsdException w:name="List Continue 5" w:semiHidden="1" w:unhideWhenUsed="1"/>
+    <w:lsdException w:name="Message Header" w:semiHidden="1" w:unhideWhenUsed="1"/>
+    <w:lsdException w:name="Subtitle" w:uiPriority="11" w:qFormat="1"/>
+    <w:lsdException w:name="Salutation" w:semiHidden="1" w:unhideWhenUsed="1"/>
+    <w:lsdException w:name="Date" w:semiHidden="1" w:unhideWhenUsed="1"/>
+    <w:lsdException w:name="Body Text First Indent" w:semiHidden="1" w:unhideWhenUsed="1"/>
+    <w:lsdException w:name="Body Text First Indent 2" w:semiHidden="1" w:unhideWhenUsed="1"/>
+    <w:lsdException w:name="Note Heading" w:semiHidden="1" w:unhideWhenUsed="1"/>
+    <w:lsdException w:name="Body Text 2" w:semiHidden="1" w:unhideWhenUsed="1"/>
+    <w:lsdException w:name="Body Text 3" w:semiHidden="1" w:unhideWhenUsed="1"/>
+    <w:lsdException w:name="Body Text Indent 2" w:semiHidden="1" w:unhideWhenUsed="1"/>
+    <w:lsdException w:name="Body Text Indent 3" w:semiHidden="1" w:unhideWhenUsed="1"/>
+    <w:lsdException w:name="Block Text" w:semiHidden="1" w:unhideWhenUsed="1"/>
+    <w:lsdException w:name="Hyperlink" w:semiHidden="1" w:unhideWhenUsed="1"/>
+    <w:lsdException w:name="FollowedHyperlink" w:semiHidden="1" w:unhideWhenUsed="1"/>
+    <w:lsdException w:name="Strong" w:uiPriority="22" w:qFormat="1"/>
+    <w:lsdException w:name="Emphasis" w:uiPriority="20" w:qFormat="1"/>
+    <w:lsdException w:name="Document Map" w:semiHidden="1" w:unhideWhenUsed="1"/>
+    <w:lsdException w:name="Plain Text" w:semiHidden="1" w:unhideWhenUsed="1"/>
+    <w:lsdException w:name="E-mail Signature" w:semiHidden="1" w:unhideWhenUsed="1"/>
+    <w:lsdException w:name="HTML Top of Form" w:semiHidden="1" w:unhideWhenUsed="1"/>
+    <w:lsdException w:name="HTML Bottom of Form" w:semiHidden="1" w:unhideWhenUsed="1"/>
+    <w:lsdException w:name="Normal (Web)" w:semiHidden="1" w:unhideWhenUsed="1"/>
+    <w:lsdException w:name="HTML Acronym" w:semiHidden="1" w:unhideWhenUsed="1"/>
+    <w:lsdException w:name="HTML Address" w:semiHidden="1" w:unhideWhenUsed="1"/>
+    <w:lsdException w:name="HTML Cite" w:semiHidden="1" w:unhideWhenUsed="1"/>
+    <w:lsdException w:name="HTML Code" w:semiHidden="1" w:unhideWhenUsed="1"/>
+    <w:lsdException w:name="HTML Definition" w:semiHidden="1" w:unhideWhenUsed="1"/>
+    <w:lsdException w:name="HTML Keyboard" w:semiHidden="1" w:unhideWhenUsed="1"/>
+    <w:lsdException w:name="HTML Preformatted" w:semiHidden="1" w:unhideWhenUsed="1"/>
+    <w:lsdException w:name="HTML Sample" w:semiHidden="1" w:unhideWhenUsed="1"/>
+    <w:lsdException w:name="HTML Typewriter" w:semiHidden="1" w:unhideWhenUsed="1"/>
+    <w:lsdException w:name="HTML Variable" w:semiHidden="1" w:unhideWhenUsed="1"/>
+    <w:lsdException w:name="Normal Table" w:semiHidden="1" w:unhideWhenUsed="1"/>
+    <w:lsdException w:name="annotation subject" w:semiHidden="1" w:unhideWhenUsed="1"/>
+    <w:lsdException w:name="No List" w:semiHidden="1" w:unhideWhenUsed="1"/>
+    <w:lsdException w:name="Outline List 1" w:semiHidden="1" w:unhideWhenUsed="1"/>
+    <w:lsdException w:name="Outline List 2" w:semiHidden="1" w:unhideWhenUsed="1"/>
+    <w:lsdException w:name="Outline List 3" w:semiHidden="1" w:unhideWhenUsed="1"/>
+    <w:lsdException w:name="Table Simple 1" w:semiHidden="1" w:unhideWhenUsed="1"/>
+    <w:lsdException w:name="Table Simple 2" w:semiHidden="1" w:unhideWhenUsed="1"/>
+    <w:lsdException w:name="Table Simple 3" w:semiHidden="1" w:unhideWhenUsed="1"/>
+    <w:lsdException w:name="Table Classic 1" w:semiHidden="1" w:unhideWhenUsed="1"/>
+    <w:lsdException w:name="Table Classic 2" w:semiHidden="1" w:unhideWhenUsed="1"/>
+    <w:lsdException w:name="Table Classic 3" w:semiHidden="1" w:unhideWhenUsed="1"/>
+    <w:lsdException w:name="Table Classic 4" w:semiHidden="1" w:unhideWhenUsed="1"/>
+    <w:lsdException w:name="Table Colorful 1" w:semiHidden="1" w:unhideWhenUsed="1"/>
+    <w:lsdException w:name="Table Colorful 2" w:semiHidden="1" w:unhideWhenUsed="1"/>
+    <w:lsdException w:name="Table Colorful 3" w:semiHidden="1" w:unhideWhenUsed="1"/>
+    <w:lsdException w:name="Table Columns 1" w:semiHidden="1" w:unhideWhenUsed="1"/>
+    <w:lsdException w:name="Table Columns 2" w:semiHidden="1" w:unhideWhenUsed="1"/>
+    <w:lsdException w:name="Table Columns 3" w:semiHidden="1" w:unhideWhenUsed="1"/>
+    <w:lsdException w:name="Table Columns 4" w:semiHidden="1" w:unhideWhenUsed="1"/>
+    <w:lsdException w:name="Table Columns 5" w:semiHidden="1" w:unhideWhenUsed="1"/>
+    <w:lsdException w:name="Table Grid 1" w:semiHidden="1" w:unhideWhenUsed="1"/>
+    <w:lsdException w:name="Table Grid 2" w:semiHidden="1" w:unhideWhenUsed="1"/>
+    <w:lsdException w:name="Table Grid 3" w:semiHidden="1" w:unhideWhenUsed="1"/>
+    <w:lsdException w:name="Table Grid 4" w:semiHidden="1" w:unhideWhenUsed="1"/>
+    <w:lsdException w:name="Table Grid 5" w:semiHidden="1" w:unhideWhenUsed="1"/>
+    <w:lsdException w:name="Table Grid 6" w:semiHidden="1" w:unhideWhenUsed="1"/>
+    <w:lsdException w:name="Table Grid 7" w:semiHidden="1" w:unhideWhenUsed="1"/>
+    <w:lsdException w:name="Table Grid 8" w:semiHidden="1" w:unhideWhenUsed="1"/>
+    <w:lsdException w:name="Table List 1" w:semiHidden="1" w:unhideWhenUsed="1"/>
+    <w:lsdException w:name="Table List 2" w:semiHidden="1" w:unhideWhenUsed="1"/>
+    <w:lsdException w:name="Table List 3" w:semiHidden="1" w:unhideWhenUsed="1"/>
+    <w:lsdException w:name="Table List 4" w:semiHidden="1" w:unhideWhenUsed="1"/>
+    <w:lsdException w:name="Table List 5" w:semiHidden="1" w:unhideWhenUsed="1"/>
+    <w:lsdException w:name="Table List 6" w:semiHidden="1" w:unhideWhenUsed="1"/>
+    <w:lsdException w:name="Table List 7" w:semiHidden="1" w:unhideWhenUsed="1"/>
+    <w:lsdException w:name="Table List 8" w:semiHidden="1" w:unhideWhenUsed="1"/>
+    <w:lsdException w:name="Table 3D effects 1" w:semiHidden="1" w:unhideWhenUsed="1"/>
+    <w:lsdException w:name="Table 3D effects 2" w:semiHidden="1" w:unhideWhenUsed="1"/>
+    <w:lsdException w:name="Table 3D effects 3" w:semiHidden="1" w:unhideWhenUsed="1"/>
+    <w:lsdException w:name="Table Contemporary" w:semiHidden="1" w:unhideWhenUsed="1"/>
+    <w:lsdException w:name="Table Elegant" w:semiHidden="1" w:unhideWhenUsed="1"/>
+    <w:lsdException w:name="Table Professional" w:semiHidden="1" w:unhideWhenUsed="1"/>
+    <w:lsdException w:name="Table Subtle 1" w:semiHidden="1" w:unhideWhenUsed="1"/>
+    <w:lsdException w:name="Table Subtle 2" w:semiHidden="1" w:unhideWhenUsed="1"/>
+    <w:lsdException w:name="Table Web 1" w:semiHidden="1" w:unhideWhenUsed="1"/>
+    <w:lsdException w:name="Table Web 2" w:semiHidden="1" w:unhideWhenUsed="1"/>
+    <w:lsdException w:name="Table Web 3" w:semiHidden="1" w:unhideWhenUsed="1"/>
+    <w:lsdException w:name="Balloon Text" w:semiHidden="1" w:unhideWhenUsed="1"/>
+    <w:lsdException w:name="Table Grid" w:uiPriority="39"/>
+    <w:lsdException w:name="Table Theme" w:semiHidden="1" w:unhideWhenUsed="1"/>
+    <w:lsdException w:name="Placeholder Text" w:semiHidden="1"/>
+    <w:lsdException w:name="No Spacing" w:uiPriority="1" w:qFormat="1"/>
+    <w:lsdException w:name="Light Shading" w:uiPriority="60"/>
+    <w:lsdException w:name="Light List" w:uiPriority="61"/>
+    <w:lsdException w:name="Light Grid" w:uiPriority="62"/>
+    <w:lsdException w:name="Medium Shading 1" w:uiPriority="63"/>
+    <w:lsdException w:name="Medium Shading 2" w:uiPriority="64"/>
+    <w:lsdException w:name="Medium List 1" w:uiPriority="65"/>
+    <w:lsdException w:name="Medium List 2" w:uiPriority="66"/>
+    <w:lsdException w:name="Medium Grid 1" w:uiPriority="67"/>
+    <w:lsdException w:name="Medium Grid 2" w:uiPriority="68"/>
+    <w:lsdException w:name="Medium Grid 3" w:uiPriority="69"/>
+    <w:lsdException w:name="Dark List" w:uiPriority="70"/>
+    <w:lsdException w:name="Colorful Shading" w:uiPriority="71"/>
+    <w:lsdException w:name="Colorful List" w:uiPriority="72"/>
+    <w:lsdException w:name="Colorful Grid" w:uiPriority="73"/>
+    <w:lsdException w:name="Light Shading Accent 1" w:uiPriority="60"/>
+    <w:lsdException w:name="Light List Accent 1" w:uiPriority="61"/>
+    <w:lsdException w:name="Light Grid Accent 1" w:uiPriority="62"/>
+    <w:lsdException w:name="Medium Shading 1 Accent 1" w:uiPriority="63"/>
+    <w:lsdException w:name="Medium Shading 2 Accent 1" w:uiPriority="64"/>
+    <w:lsdException w:name="Medium List 1 Accent 1" w:uiPriority="65"/>
+    <w:lsdException w:name="Revision" w:semiHidden="1"/>
+    <w:lsdException w:name="List Paragraph" w:uiPriority="34" w:qFormat="1"/>
+    <w:lsdException w:name="Quote" w:uiPriority="29" w:qFormat="1"/>
+    <w:lsdException w:name="Intense Quote" w:uiPriority="30" w:qFormat="1"/>
+    <w:lsdException w:name="Medium List 2 Accent 1" w:uiPriority="66"/>
+    <w:lsdException w:name="Medium Grid 1 Accent 1" w:uiPriority="67"/>
+    <w:lsdException w:name="Medium Grid 2 Accent 1" w:uiPriority="68"/>
+    <w:lsdException w:name="Medium Grid 3 Accent 1" w:uiPriority="69"/>
+    <w:lsdException w:name="Dark List Accent 1" w:uiPriority="70"/>
+    <w:lsdException w:name="Colorful Shading Accent 1" w:uiPriority="71"/>
+    <w:lsdException w:name="Colorful List Accent 1" w:uiPriority="72"/>
+    <w:lsdException w:name="Colorful Grid Accent 1" w:uiPriority="73"/>
+    <w:lsdException w:name="Light Shading Accent 2" w:uiPriority="60"/>
+    <w:lsdException w:name="Light List Accent 2" w:uiPriority="61"/>
+    <w:lsdException w:name="Light Grid Accent 2" w:uiPriority="62"/>
+    <w:lsdException w:name="Medium Shading 1 Accent 2" w:uiPriority="63"/>
+    <w:lsdException w:name="Medium Shading 2 Accent 2" w:uiPriority="64"/>
+    <w:lsdException w:name="Medium List 1 Accent 2" w:uiPriority="65"/>
+    <w:lsdException w:name="Medium List 2 Accent 2" w:uiPriority="66"/>
+    <w:lsdException w:name="Medium Grid 1 Accent 2" w:uiPriority="67"/>
+    <w:lsdException w:name="Medium Grid 2 Accent 2" w:uiPriority="68"/>
+    <w:lsdException w:name="Medium Grid 3 Accent 2" w:uiPriority="69"/>
+    <w:lsdException w:name="Dark List Accent 2" w:uiPriority="70"/>
+    <w:lsdException w:name="Colorful Shading Accent 2" w:uiPriority="71"/>
+    <w:lsdException w:name="Colorful List Accent 2" w:uiPriority="72"/>
+    <w:lsdException w:name="Colorful Grid Accent 2" w:uiPriority="73"/>
+    <w:lsdException w:name="Light Shading Accent 3" w:uiPriority="60"/>
+    <w:lsdException w:name="Light List Accent 3" w:uiPriority="61"/>
+    <w:lsdException w:name="Light Grid Accent 3" w:uiPriority="62"/>
+    <w:lsdException w:name="Medium Shading 1 Accent 3" w:uiPriority="63"/>
+    <w:lsdException w:name="Medium Shading 2 Accent 3" w:uiPriority="64"/>
+    <w:lsdException w:name="Medium List 1 Accent 3" w:uiPriority="65"/>
+    <w:lsdException w:name="Medium List 2 Accent 3" w:uiPriority="66"/>
+    <w:lsdException w:name="Medium Grid 1 Accent 3" w:uiPriority="67"/>
+    <w:lsdException w:name="Medium Grid 2 Accent 3" w:uiPriority="68"/>
+    <w:lsdException w:name="Medium Grid 3 Accent 3" w:uiPriority="69"/>
+    <w:lsdException w:name="Dark List Accent 3" w:uiPriority="70"/>
+    <w:lsdException w:name="Colorful Shading Accent 3" w:uiPriority="71"/>
+    <w:lsdException w:name="Colorful List Accent 3" w:uiPriority="72"/>
+    <w:lsdException w:name="Colorful Grid Accent 3" w:uiPriority="73"/>
+    <w:lsdException w:name="Light Shading Accent 4" w:uiPriority="60"/>
+    <w:lsdException w:name="Light List Accent 4" w:uiPriority="61"/>
+    <w:lsdException w:name="Light Grid Accent 4" w:uiPriority="62"/>
+    <w:lsdException w:name="Medium Shading 1 Accent 4" w:uiPriority="63"/>
+    <w:lsdException w:name="Medium Shading 2 Accent 4" w:uiPriority="64"/>
+    <w:lsdException w:name="Medium List 1 Accent 4" w:uiPriority="65"/>
+    <w:lsdException w:name="Medium List 2 Accent 4" w:uiPriority="66"/>
+    <w:lsdException w:name="Medium Grid 1 Accent 4" w:uiPriority="67"/>
+    <w:lsdException w:name="Medium Grid 2 Accent 4" w:uiPriority="68"/>
+    <w:lsdException w:name="Medium Grid 3 Accent 4" w:uiPriority="69"/>
+    <w:lsdException w:name="Dark List Accent 4" w:uiPriority="70"/>
+    <w:lsdException w:name="Colorful Shading Accent 4" w:uiPriority="71"/>
+    <w:lsdException w:name="Colorful List Accent 4" w:uiPriority="72"/>
+    <w:lsdException w:name="Colorful Grid Accent 4" w:uiPriority="73"/>
+    <w:lsdException w:name="Light Shading Accent 5" w:uiPriority="60"/>
+    <w:lsdException w:name="Light List Accent 5" w:uiPriority="61"/>
+    <w:lsdException w:name="Light Grid Accent 5" w:uiPriority="62"/>
+    <w:lsdException w:name="Medium Shading 1 Accent 5" w:uiPriority="63"/>
+    <w:lsdException w:name="Medium Shading 2 Accent 5" w:uiPriority="64"/>
+    <w:lsdException w:name="Medium List 1 Accent 5" w:uiPriority="65"/>
+    <w:lsdException w:name="Medium List 2 Accent 5" w:uiPriority="66"/>
+    <w:lsdException w:name="Medium Grid 1 Accent 5" w:uiPriority="67"/>
+    <w:lsdException w:name="Medium Grid 2 Accent 5" w:uiPriority="68"/>
+    <w:lsdException w:name="Medium Grid 3 Accent 5" w:uiPriority="69"/>
+    <w:lsdException w:name="Dark List Accent 5" w:uiPriority="70"/>
+    <w:lsdException w:name="Colorful Shading Accent 5" w:uiPriority="71"/>
+    <w:lsdException w:name="Colorful List Accent 5" w:uiPriority="72"/>
+    <w:lsdException w:name="Colorful Grid Accent 5" w:uiPriority="73"/>
+    <w:lsdException w:name="Light Shading Accent 6" w:uiPriority="60"/>
+    <w:lsdException w:name="Light List Accent 6" w:uiPriority="61"/>
+    <w:lsdException w:name="Light Grid Accent 6" w:uiPriority="62"/>
+    <w:lsdException w:name="Medium Shading 1 Accent 6" w:uiPriority="63"/>
+    <w:lsdException w:name="Medium Shading 2 Accent 6" w:uiPriority="64"/>
+    <w:lsdException w:name="Medium List 1 Accent 6" w:uiPriority="65"/>
+    <w:lsdException w:name="Medium List 2 Accent 6" w:uiPriority="66"/>
+    <w:lsdException w:name="Medium Grid 1 Accent 6" w:uiPriority="67"/>
+    <w:lsdException w:name="Medium Grid 2 Accent 6" w:uiPriority="68"/>
+    <w:lsdException w:name="Medium Grid 3 Accent 6" w:uiPriority="69"/>
+    <w:lsdException w:name="Dark List Accent 6" w:uiPriority="70"/>
+    <w:lsdException w:name="Colorful Shading Accent 6" w:uiPriority="71"/>
+    <w:lsdException w:name="Colorful List Accent 6" w:uiPriority="72"/>
+    <w:lsdException w:name="Colorful Grid Accent 6" w:uiPriority="73"/>
+    <w:lsdException w:name="Subtle Emphasis" w:uiPriority="19" w:qFormat="1"/>
+    <w:lsdException w:name="Intense Emphasis" w:uiPriority="21" w:qFormat="1"/>
+    <w:lsdException w:name="Subtle Reference" w:uiPriority="31" w:qFormat="1"/>
+    <w:lsdException w:name="Intense Reference" w:uiPriority="32" w:qFormat="1"/>
+    <w:lsdException w:name="Book Title" w:uiPriority="33" w:qFormat="1"/>
+    <w:lsdException w:name="Bibliography" w:semiHidden="1" w:uiPriority="37" w:unhideWhenUsed="1"/>
+    <w:lsdException w:name="TOC Heading" w:semiHidden="1" w:uiPriority="39" w:unhideWhenUsed="1" w:qFormat="1"/>
+    <w:lsdException w:name="Plain Table 1" w:uiPriority="41"/>
+    <w:lsdException w:name="Plain Table 2" w:uiPriority="42"/>
+    <w:lsdException w:name="Plain Table 3" w:uiPriority="43"/>
+    <w:lsdException w:name="Plain Table 4" w:uiPriority="44"/>
+    <w:lsdException w:name="Plain Table 5" w:uiPriority="45"/>
+    <w:lsdException w:name="Grid Table Light" w:uiPriority="40"/>
+    <w:lsdException w:name="Grid Table 1 Light" w:uiPriority="46"/>
+    <w:lsdException w:name="Grid Table 2" w:uiPriority="47"/>
+    <w:lsdException w:name="Grid Table 3" w:uiPriority="48"/>
+    <w:lsdException w:name="Grid Table 4" w:uiPriority="49"/>
+    <w:lsdException w:name="Grid Table 5 Dark" w:uiPriority="50"/>
+    <w:lsdException w:name="Grid Table 6 Colorful" w:uiPriority="51"/>
+    <w:lsdException w:name="Grid Table 7 Colorful" w:uiPriority="52"/>
+    <w:lsdException w:name="Grid Table 1 Light Accent 1" w:uiPriority="46"/>
+    <w:lsdException w:name="Grid Table 2 Accent 1" w:uiPriority="47"/>
+    <w:lsdException w:name="Grid Table 3 Accent 1" w:uiPriority="48"/>
+    <w:lsdException w:name="Grid Table 4 Accent 1" w:uiPriority="49"/>
+    <w:lsdException w:name="Grid Table 5 Dark Accent 1" w:uiPriority="50"/>
+    <w:lsdException w:name="Grid Table 6 Colorful Accent 1" w:uiPriority="51"/>
+    <w:lsdException w:name="Grid Table 7 Colorful Accent 1" w:uiPriority="52"/>
+    <w:lsdException w:name="Grid Table 1 Light Accent 2" w:uiPriority="46"/>
+    <w:lsdException w:name="Grid Table 2 Accent 2" w:uiPriority="47"/>
+    <w:lsdException w:name="Grid Table 3 Accent 2" w:uiPriority="48"/>
+    <w:lsdException w:name="Grid Table 4 Accent 2" w:uiPriority="49"/>
+    <w:lsdException w:name="Grid Table 5 Dark Accent 2" w:uiPriority="50"/>
+    <w:lsdException w:name="Grid Table 6 Colorful Accent 2" w:uiPriority="51"/>
+    <w:lsdException w:name="Grid Table 7 Colorful Accent 2" w:uiPriority="52"/>
+    <w:lsdException w:name="Grid Table 1 Light Accent 3" w:uiPriority="46"/>
+    <w:lsdException w:name="Grid Table 2 Accent 3" w:uiPriority="47"/>
+    <w:lsdException w:name="Grid Table 3 Accent 3" w:uiPriority="48"/>
+    <w:lsdException w:name="Grid Table 4 Accent 3" w:uiPriority="49"/>
+    <w:lsdException w:name="Grid Table 5 Dark Accent 3" w:uiPriority="50"/>
+    <w:lsdException w:name="Grid Table 6 Colorful Accent 3" w:uiPriority="51"/>
+    <w:lsdException w:name="Grid Table 7 Colorful Accent 3" w:uiPriority="52"/>
+    <w:lsdException w:name="Grid Table 1 Light Accent 4" w:uiPriority="46"/>
+    <w:lsdException w:name="Grid Table 2 Accent 4" w:uiPriority="47"/>
+    <w:lsdException w:name="Grid Table 3 Accent 4" w:uiPriority="48"/>
+    <w:lsdException w:name="Grid Table 4 Accent 4" w:uiPriority="49"/>
+    <w:lsdException w:name="Grid Table 5 Dark Accent 4" w:uiPriority="50"/>
+    <w:lsdException w:name="Grid Table 6 Colorful Accent 4" w:uiPriority="51"/>
+    <w:lsdException w:name="Grid Table 7 Colorful Accent 4" w:uiPriority="52"/>
+    <w:lsdException w:name="Grid Table 1 Light Accent 5" w:uiPriority="46"/>
+    <w:lsdException w:name="Grid Table 2 Accent 5" w:uiPriority="47"/>
+    <w:lsdException w:name="Grid Table 3 Accent 5" w:uiPriority="48"/>
+    <w:lsdException w:name="Grid Table 4 Accent 5" w:uiPriority="49"/>
+    <w:lsdException w:name="Grid Table 5 Dark Accent 5" w:uiPriority="50"/>
+    <w:lsdException w:name="Grid Table 6 Colorful Accent 5" w:uiPriority="51"/>
+    <w:lsdException w:name="Grid Table 7 Colorful Accent 5" w:uiPriority="52"/>
+    <w:lsdException w:name="Grid Table 1 Light Accent 6" w:uiPriority="46"/>
+    <w:lsdException w:name="Grid Table 2 Accent 6" w:uiPriority="47"/>
+    <w:lsdException w:name="Grid Table 3 Accent 6" w:uiPriority="48"/>
+    <w:lsdException w:name="Grid Table 4 Accent 6" w:uiPriority="49"/>
+    <w:lsdException w:name="Grid Table 5 Dark Accent 6" w:uiPriority="50"/>
+    <w:lsdException w:name="Grid Table 6 Colorful Accent 6" w:uiPriority="51"/>
+    <w:lsdException w:name="Grid Table 7 Colorful Accent 6" w:uiPriority="52"/>
+    <w:lsdException w:name="List Table 1 Light" w:uiPriority="46"/>
+    <w:lsdException w:name="List Table 2" w:uiPriority="47"/>
+    <w:lsdException w:name="List Table 3" w:uiPriority="48"/>
+    <w:lsdException w:name="List Table 4" w:uiPriority="49"/>
+    <w:lsdException w:name="List Table 5 Dark" w:uiPriority="50"/>
+    <w:lsdException w:name="List Table 6 Colorful" w:uiPriority="51"/>
+    <w:lsdException w:name="List Table 7 Colorful" w:uiPriority="52"/>
+    <w:lsdException w:name="List Table 1 Light Accent 1" w:uiPriority="46"/>
+    <w:lsdException w:name="List Table 2 Accent 1" w:uiPriority="47"/>
+    <w:lsdException w:name="List Table 3 Accent 1" w:uiPriority="48"/>
+    <w:lsdException w:name="List Table 4 Accent 1" w:uiPriority="49"/>
+    <w:lsdException w:name="List Table 5 Dark Accent 1" w:uiPriority="50"/>
+    <w:lsdException w:name="List Table 6 Colorful Accent 1" w:uiPriority="51"/>
+    <w:lsdException w:name="List Table 7 Colorful Accent 1" w:uiPriority="52"/>
+    <w:lsdException w:name="List Table 1 Light Accent 2" w:uiPriority="46"/>
+    <w:lsdException w:name="List Table 2 Accent 2" w:uiPriority="47"/>
+    <w:lsdException w:name="List Table 3 Accent 2" w:uiPriority="48"/>
+    <w:lsdException w:name="List Table 4 Accent 2" w:uiPriority="49"/>
+    <w:lsdException w:name="List Table 5 Dark Accent 2" w:uiPriority="50"/>
+    <w:lsdException w:name="List Table 6 Colorful Accent 2" w:uiPriority="51"/>
+    <w:lsdException w:name="List Table 7 Colorful Accent 2" w:uiPriority="52"/>
+    <w:lsdException w:name="List Table 1 Light Accent 3" w:uiPriority="46"/>
+    <w:lsdException w:name="List Table 2 Accent 3" w:uiPriority="47"/>
+    <w:lsdException w:name="List Table 3 Accent 3" w:uiPriority="48"/>
+    <w:lsdException w:name="List Table 4 Accent 3" w:uiPriority="49"/>
+    <w:lsdException w:name="List Table 5 Dark Accent 3" w:uiPriority="50"/>
+    <w:lsdException w:name="List Table 6 Colorful Accent 3" w:uiPriority="51"/>
+    <w:lsdException w:name="List Table 7 Colorful Accent 3" w:uiPriority="52"/>
+    <w:lsdException w:name="List Table 1 Light Accent 4" w:uiPriority="46"/>
+    <w:lsdException w:name="List Table 2 Accent 4" w:uiPriority="47"/>
+    <w:lsdException w:name="List Table 3 Accent 4" w:uiPriority="48"/>
+    <w:lsdException w:name="List Table 4 Accent 4" w:uiPriority="49"/>
+    <w:lsdException w:name="List Table 5 Dark Accent 4" w:uiPriority="50"/>
+    <w:lsdException w:name="List Table 6 Colorful Accent 4" w:uiPriority="51"/>
+    <w:lsdException w:name="List Table 7 Colorful Accent 4" w:uiPriority="52"/>
+    <w:lsdException w:name="List Table 1 Light Accent 5" w:uiPriority="46"/>
+    <w:lsdException w:name="List Table 2 Accent 5" w:uiPriority="47"/>
+    <w:lsdException w:name="List Table 3 Accent 5" w:uiPriority="48"/>
+    <w:lsdException w:name="List Table 4 Accent 5" w:uiPriority="49"/>
+    <w:lsdException w:name="List Table 5 Dark Accent 5" w:uiPriority="50"/>
+    <w:lsdException w:name="List Table 6 Colorful Accent 5" w:uiPriority="51"/>
+    <w:lsdException w:name="List Table 7 Colorful Accent 5" w:uiPriority="52"/>
+    <w:lsdException w:name="List Table 1 Light Accent 6" w:uiPriority="46"/>
+    <w:lsdException w:name="List Table 2 Accent 6" w:uiPriority="47"/>
+    <w:lsdException w:name="List Table 3 Accent 6" w:uiPriority="48"/>
+    <w:lsdException w:name="List Table 4 Accent 6" w:uiPriority="49"/>
+    <w:lsdException w:name="List Table 5 Dark Accent 6" w:uiPriority="50"/>
+    <w:lsdException w:name="List Table 6 Colorful Accent 6" w:uiPriority="51"/>
+    <w:lsdException w:name="List Table 7 Colorful Accent 6" w:uiPriority="52"/>
+    <w:lsdException w:name="Mention" w:semiHidden="1" w:unhideWhenUsed="1"/>
+    <w:lsdException w:name="Smart Hyperlink" w:semiHidden="1" w:unhideWhenUsed="1"/>
+    <w:lsdException w:name="Hashtag" w:semiHidden="1" w:unhideWhenUsed="1"/>
+    <w:lsdException w:name="Unresolved Mention" w:semiHidden="1" w:unhideWhenUsed="1"/>
+  </w:latentStyles>
+  <w:style w:type="paragraph" w:default="1" w:styleId="Normal">
+    <w:name w:val="Normal"/>
+    <w:qFormat/>
   </w:style>
   <w:style w:type="paragraph" w:styleId="Heading1">
     <w:name w:val="heading 1"/>
     <w:basedOn w:val="Normal"/>
     <w:next w:val="Normal"/>
+    <w:uiPriority w:val="9"/>
+    <w:qFormat/>
     <w:pPr>
-      <w:keepNext w:val="1"/>
-      <w:keepLines w:val="1"/>
-      <w:pageBreakBefore w:val="0"/>
-      <w:spacing w:after="120" w:before="400" w:lineRule="auto"/>
+      <w:keepNext/>
+      <w:keepLines/>
+      <w:spacing w:before="400" w:after="120"/>
+      <w:outlineLvl w:val="0"/>
     </w:pPr>
     <w:rPr>
       <w:sz w:val="40"/>
@@ -2926,15 +3129,17 @@
     <w:name w:val="heading 2"/>
     <w:basedOn w:val="Normal"/>
     <w:next w:val="Normal"/>
+    <w:uiPriority w:val="9"/>
+    <w:semiHidden/>
+    <w:unhideWhenUsed/>
+    <w:qFormat/>
     <w:pPr>
-      <w:keepNext w:val="1"/>
-      <w:keepLines w:val="1"/>
-      <w:pageBreakBefore w:val="0"/>
-      <w:spacing w:after="120" w:before="360" w:lineRule="auto"/>
+      <w:keepNext/>
+      <w:keepLines/>
+      <w:spacing w:before="360" w:after="120"/>
+      <w:outlineLvl w:val="1"/>
     </w:pPr>
     <w:rPr>
-      <w:b w:val="0"/>
-      <w:bCs w:val="0"/>
       <w:sz w:val="32"/>
       <w:szCs w:val="32"/>
     </w:rPr>
@@ -2943,15 +3148,17 @@
     <w:name w:val="heading 3"/>
     <w:basedOn w:val="Normal"/>
     <w:next w:val="Normal"/>
+    <w:uiPriority w:val="9"/>
+    <w:semiHidden/>
+    <w:unhideWhenUsed/>
+    <w:qFormat/>
     <w:pPr>
-      <w:keepNext w:val="1"/>
-      <w:keepLines w:val="1"/>
-      <w:pageBreakBefore w:val="0"/>
-      <w:spacing w:after="80" w:before="320" w:lineRule="auto"/>
+      <w:keepNext/>
+      <w:keepLines/>
+      <w:spacing w:before="320" w:after="80"/>
+      <w:outlineLvl w:val="2"/>
     </w:pPr>
     <w:rPr>
-      <w:b w:val="0"/>
-      <w:bCs w:val="0"/>
       <w:color w:val="434343"/>
       <w:sz w:val="28"/>
       <w:szCs w:val="28"/>
@@ -2961,11 +3168,15 @@
     <w:name w:val="heading 4"/>
     <w:basedOn w:val="Normal"/>
     <w:next w:val="Normal"/>
+    <w:uiPriority w:val="9"/>
+    <w:semiHidden/>
+    <w:unhideWhenUsed/>
+    <w:qFormat/>
     <w:pPr>
-      <w:keepNext w:val="1"/>
-      <w:keepLines w:val="1"/>
-      <w:pageBreakBefore w:val="0"/>
-      <w:spacing w:after="80" w:before="280" w:lineRule="auto"/>
+      <w:keepNext/>
+      <w:keepLines/>
+      <w:spacing w:before="280" w:after="80"/>
+      <w:outlineLvl w:val="3"/>
     </w:pPr>
     <w:rPr>
       <w:color w:val="666666"/>
@@ -2977,45 +3188,88 @@
     <w:name w:val="heading 5"/>
     <w:basedOn w:val="Normal"/>
     <w:next w:val="Normal"/>
+    <w:uiPriority w:val="9"/>
+    <w:semiHidden/>
+    <w:unhideWhenUsed/>
+    <w:qFormat/>
     <w:pPr>
-      <w:keepNext w:val="1"/>
-      <w:keepLines w:val="1"/>
-      <w:pageBreakBefore w:val="0"/>
-      <w:spacing w:after="80" w:before="240" w:lineRule="auto"/>
+      <w:keepNext/>
+      <w:keepLines/>
+      <w:spacing w:before="240" w:after="80"/>
+      <w:outlineLvl w:val="4"/>
     </w:pPr>
     <w:rPr>
       <w:color w:val="666666"/>
-      <w:sz w:val="22"/>
-      <w:szCs w:val="22"/>
     </w:rPr>
   </w:style>
   <w:style w:type="paragraph" w:styleId="Heading6">
     <w:name w:val="heading 6"/>
     <w:basedOn w:val="Normal"/>
     <w:next w:val="Normal"/>
+    <w:uiPriority w:val="9"/>
+    <w:semiHidden/>
+    <w:unhideWhenUsed/>
+    <w:qFormat/>
     <w:pPr>
-      <w:keepNext w:val="1"/>
-      <w:keepLines w:val="1"/>
-      <w:pageBreakBefore w:val="0"/>
-      <w:spacing w:after="80" w:before="240" w:lineRule="auto"/>
+      <w:keepNext/>
+      <w:keepLines/>
+      <w:spacing w:before="240" w:after="80"/>
+      <w:outlineLvl w:val="5"/>
     </w:pPr>
     <w:rPr>
-      <w:i w:val="1"/>
-      <w:iCs w:val="1"/>
+      <w:i/>
+      <w:iCs/>
       <w:color w:val="666666"/>
-      <w:sz w:val="22"/>
-      <w:szCs w:val="22"/>
     </w:rPr>
+  </w:style>
+  <w:style w:type="character" w:default="1" w:styleId="DefaultParagraphFont">
+    <w:name w:val="Default Paragraph Font"/>
+    <w:uiPriority w:val="1"/>
+    <w:semiHidden/>
+    <w:unhideWhenUsed/>
+  </w:style>
+  <w:style w:type="table" w:default="1" w:styleId="TableNormal">
+    <w:name w:val="Normal Table"/>
+    <w:uiPriority w:val="99"/>
+    <w:semiHidden/>
+    <w:unhideWhenUsed/>
+    <w:tblPr>
+      <w:tblInd w:w="0" w:type="dxa"/>
+      <w:tblCellMar>
+        <w:top w:w="0" w:type="dxa"/>
+        <w:left w:w="108" w:type="dxa"/>
+        <w:bottom w:w="0" w:type="dxa"/>
+        <w:right w:w="108" w:type="dxa"/>
+      </w:tblCellMar>
+    </w:tblPr>
+  </w:style>
+  <w:style w:type="numbering" w:default="1" w:styleId="NoList">
+    <w:name w:val="No List"/>
+    <w:uiPriority w:val="99"/>
+    <w:semiHidden/>
+    <w:unhideWhenUsed/>
+  </w:style>
+  <w:style w:type="table" w:customStyle="1" w:styleId="TableNormal0">
+    <w:name w:val="TableNormal"/>
+    <w:tblPr>
+      <w:tblCellMar>
+        <w:top w:w="100" w:type="dxa"/>
+        <w:left w:w="100" w:type="dxa"/>
+        <w:bottom w:w="100" w:type="dxa"/>
+        <w:right w:w="100" w:type="dxa"/>
+      </w:tblCellMar>
+    </w:tblPr>
   </w:style>
   <w:style w:type="paragraph" w:styleId="Title">
     <w:name w:val="Title"/>
     <w:basedOn w:val="Normal"/>
     <w:next w:val="Normal"/>
+    <w:uiPriority w:val="10"/>
+    <w:qFormat/>
     <w:pPr>
-      <w:keepNext w:val="1"/>
-      <w:keepLines w:val="1"/>
-      <w:pageBreakBefore w:val="0"/>
-      <w:spacing w:after="60" w:before="0" w:lineRule="auto"/>
+      <w:keepNext/>
+      <w:keepLines/>
+      <w:spacing w:after="60"/>
     </w:pPr>
     <w:rPr>
       <w:sz w:val="52"/>
@@ -3026,16 +3280,14 @@
     <w:name w:val="Subtitle"/>
     <w:basedOn w:val="Normal"/>
     <w:next w:val="Normal"/>
+    <w:uiPriority w:val="11"/>
+    <w:qFormat/>
     <w:pPr>
-      <w:keepNext w:val="1"/>
-      <w:keepLines w:val="1"/>
-      <w:pageBreakBefore w:val="0"/>
-      <w:spacing w:after="320" w:before="0" w:lineRule="auto"/>
+      <w:keepNext/>
+      <w:keepLines/>
+      <w:spacing w:after="320"/>
     </w:pPr>
     <w:rPr>
-      <w:rFonts w:ascii="Arial" w:cs="Arial" w:eastAsia="Arial" w:hAnsi="Arial"/>
-      <w:i w:val="0"/>
-      <w:iCs w:val="0"/>
       <w:color w:val="666666"/>
       <w:sz w:val="30"/>
       <w:szCs w:val="30"/>

</xml_diff>